<commit_message>
Agregar la gestión de las comunicaciones y su tablero
- Bloque propio dentro del capítulo de Interesados con los tres procesos:
  planificar, gestionar y monitorear las comunicaciones.
- Plan de gestión de las comunicaciones (INT-03) reforzado con requisitos de
  información, calendario, formatos, indicadores y glosario.
- Documentos nuevos: registro de comunicaciones (INT-06) e informe de
  monitoreo N.º 1 (INT-07).
- Tablero de comunicaciones en el blog, alimentado por el registro: realizadas,
  programadas y vencidas, por sprint, canal e interesado.

Co-Authored-By: Claude Opus 5.5 <noreply@anthropic.com>
</commit_message>
<xml_diff>
--- a/public/documentos/ALC-01-plan-de-gestion-del-alcance-y-de-los-requisitos.docx
+++ b/public/documentos/ALC-01-plan-de-gestion-del-alcance-y-de-los-requisitos.docx
@@ -18,7 +18,7 @@
           <w:left w:w="10" w:type="dxa"/>
           <w:right w:w="10" w:type="dxa"/>
         </w:tblCellMar>
-        <w:tblLook w:val="04A0" w:firstRow="1" w:lastRow="0" w:firstColumn="1" w:lastColumn="0" w:noHBand="0" w:noVBand="1"/>
+        <w:tblLook w:val="0000" w:firstRow="0" w:lastRow="0" w:firstColumn="0" w:lastColumn="0" w:noHBand="0" w:noVBand="0"/>
       </w:tblPr>
       <w:tblGrid>
         <w:gridCol w:w="1757"/>
@@ -52,7 +52,7 @@
                 <w:noProof/>
               </w:rPr>
               <w:drawing>
-                <wp:inline distT="0" distB="0" distL="0" distR="0" wp14:anchorId="163EAA1C" wp14:editId="7D10A2B3">
+                <wp:inline distT="0" distB="0" distL="0" distR="0" wp14:anchorId="488D5AEC" wp14:editId="71E5DF15">
                   <wp:extent cx="990600" cy="990600"/>
                   <wp:effectExtent l="0" t="0" r="0" b="0"/>
                   <wp:docPr id="1" name="Imagen 1"/>
@@ -171,10 +171,10 @@
                 <w:noProof/>
               </w:rPr>
               <w:drawing>
-                <wp:inline distT="0" distB="0" distL="0" distR="0" wp14:anchorId="023EA584" wp14:editId="38606F6D">
+                <wp:inline distT="0" distB="0" distL="0" distR="0" wp14:anchorId="1AAC102F" wp14:editId="55F58FBF">
                   <wp:extent cx="800100" cy="800100"/>
                   <wp:effectExtent l="0" t="0" r="0" b="0"/>
-                  <wp:docPr id="1380346277" name="Imagen 1380346277"/>
+                  <wp:docPr id="986558357" name="Imagen 986558357"/>
                   <wp:cNvGraphicFramePr>
                     <a:graphicFrameLocks xmlns:a="http://schemas.openxmlformats.org/drawingml/2006/main" noChangeAspect="1"/>
                   </wp:cNvGraphicFramePr>
@@ -308,7 +308,7 @@
           <w:left w:w="10" w:type="dxa"/>
           <w:right w:w="10" w:type="dxa"/>
         </w:tblCellMar>
-        <w:tblLook w:val="04A0" w:firstRow="1" w:lastRow="0" w:firstColumn="1" w:lastColumn="0" w:noHBand="0" w:noVBand="1"/>
+        <w:tblLook w:val="0000" w:firstRow="0" w:lastRow="0" w:firstColumn="0" w:lastColumn="0" w:noHBand="0" w:noVBand="0"/>
       </w:tblPr>
       <w:tblGrid>
         <w:gridCol w:w="2636"/>
@@ -786,7 +786,7 @@
           <w:left w:w="10" w:type="dxa"/>
           <w:right w:w="10" w:type="dxa"/>
         </w:tblCellMar>
-        <w:tblLook w:val="04A0" w:firstRow="1" w:lastRow="0" w:firstColumn="1" w:lastColumn="0" w:noHBand="0" w:noVBand="1"/>
+        <w:tblLook w:val="0000" w:firstRow="0" w:lastRow="0" w:firstColumn="0" w:lastColumn="0" w:noHBand="0" w:noVBand="0"/>
       </w:tblPr>
       <w:tblGrid>
         <w:gridCol w:w="4042"/>
@@ -1399,7 +1399,7 @@
           <w:left w:w="10" w:type="dxa"/>
           <w:right w:w="10" w:type="dxa"/>
         </w:tblCellMar>
-        <w:tblLook w:val="04A0" w:firstRow="1" w:lastRow="0" w:firstColumn="1" w:lastColumn="0" w:noHBand="0" w:noVBand="1"/>
+        <w:tblLook w:val="0000" w:firstRow="0" w:lastRow="0" w:firstColumn="0" w:lastColumn="0" w:noHBand="0" w:noVBand="0"/>
       </w:tblPr>
       <w:tblGrid>
         <w:gridCol w:w="2636"/>
@@ -1817,7 +1817,7 @@
           <w:left w:w="10" w:type="dxa"/>
           <w:right w:w="10" w:type="dxa"/>
         </w:tblCellMar>
-        <w:tblLook w:val="04A0" w:firstRow="1" w:lastRow="0" w:firstColumn="1" w:lastColumn="0" w:noHBand="0" w:noVBand="1"/>
+        <w:tblLook w:val="0000" w:firstRow="0" w:lastRow="0" w:firstColumn="0" w:lastColumn="0" w:noHBand="0" w:noVBand="0"/>
       </w:tblPr>
       <w:tblGrid>
         <w:gridCol w:w="1054"/>
@@ -2158,7 +2158,7 @@
           <w:left w:w="10" w:type="dxa"/>
           <w:right w:w="10" w:type="dxa"/>
         </w:tblCellMar>
-        <w:tblLook w:val="04A0" w:firstRow="1" w:lastRow="0" w:firstColumn="1" w:lastColumn="0" w:noHBand="0" w:noVBand="1"/>
+        <w:tblLook w:val="0000" w:firstRow="0" w:lastRow="0" w:firstColumn="0" w:lastColumn="0" w:noHBand="0" w:noVBand="0"/>
       </w:tblPr>
       <w:tblGrid>
         <w:gridCol w:w="2636"/>
@@ -2498,7 +2498,7 @@
           <w:left w:w="10" w:type="dxa"/>
           <w:right w:w="10" w:type="dxa"/>
         </w:tblCellMar>
-        <w:tblLook w:val="04A0" w:firstRow="1" w:lastRow="0" w:firstColumn="1" w:lastColumn="0" w:noHBand="0" w:noVBand="1"/>
+        <w:tblLook w:val="0000" w:firstRow="0" w:lastRow="0" w:firstColumn="0" w:lastColumn="0" w:noHBand="0" w:noVBand="0"/>
       </w:tblPr>
       <w:tblGrid>
         <w:gridCol w:w="8787"/>
@@ -2585,7 +2585,7 @@
     <w:sdt>
       <w:sdtPr>
         <w:alias w:val="Contenido"/>
-        <w:id w:val="-93095512"/>
+        <w:id w:val="489909551"/>
       </w:sdtPr>
       <w:sdtEndPr/>
       <w:sdtContent>
@@ -2611,7 +2611,7 @@
           <w:r>
             <w:fldChar w:fldCharType="separate"/>
           </w:r>
-          <w:hyperlink w:anchor="_Toc242536768" w:history="1">
+          <w:hyperlink w:anchor="_Toc242538796" w:history="1">
             <w:r>
               <w:rPr>
                 <w:rStyle w:val="Hipervnculo"/>
@@ -2635,7 +2635,7 @@
               <w:rPr>
                 <w:noProof/>
               </w:rPr>
-              <w:instrText xml:space="preserve"> PAGEREF _Toc242536768 \h </w:instrText>
+              <w:instrText xml:space="preserve"> PAGEREF _Toc242538796 \h </w:instrText>
             </w:r>
             <w:r>
               <w:rPr>
@@ -2675,7 +2675,7 @@
               <w14:ligatures w14:val="standardContextual"/>
             </w:rPr>
           </w:pPr>
-          <w:hyperlink w:anchor="_Toc242536769" w:history="1">
+          <w:hyperlink w:anchor="_Toc242538797" w:history="1">
             <w:r>
               <w:rPr>
                 <w:rStyle w:val="Hipervnculo"/>
@@ -2699,7 +2699,7 @@
               <w:rPr>
                 <w:noProof/>
               </w:rPr>
-              <w:instrText xml:space="preserve"> PAGEREF _Toc242536769 \h </w:instrText>
+              <w:instrText xml:space="preserve"> PAGEREF _Toc242538797 \h </w:instrText>
             </w:r>
             <w:r>
               <w:rPr>
@@ -2739,7 +2739,7 @@
               <w14:ligatures w14:val="standardContextual"/>
             </w:rPr>
           </w:pPr>
-          <w:hyperlink w:anchor="_Toc242536770" w:history="1">
+          <w:hyperlink w:anchor="_Toc242538798" w:history="1">
             <w:r>
               <w:rPr>
                 <w:rStyle w:val="Hipervnculo"/>
@@ -2763,7 +2763,7 @@
               <w:rPr>
                 <w:noProof/>
               </w:rPr>
-              <w:instrText xml:space="preserve"> PAGEREF _Toc242536770 \h </w:instrText>
+              <w:instrText xml:space="preserve"> PAGEREF _Toc242538798 \h </w:instrText>
             </w:r>
             <w:r>
               <w:rPr>
@@ -2803,7 +2803,7 @@
               <w14:ligatures w14:val="standardContextual"/>
             </w:rPr>
           </w:pPr>
-          <w:hyperlink w:anchor="_Toc242536771" w:history="1">
+          <w:hyperlink w:anchor="_Toc242538799" w:history="1">
             <w:r>
               <w:rPr>
                 <w:rStyle w:val="Hipervnculo"/>
@@ -2827,7 +2827,7 @@
               <w:rPr>
                 <w:noProof/>
               </w:rPr>
-              <w:instrText xml:space="preserve"> PAGEREF _Toc242536771 \h </w:instrText>
+              <w:instrText xml:space="preserve"> PAGEREF _Toc242538799 \h </w:instrText>
             </w:r>
             <w:r>
               <w:rPr>
@@ -2867,7 +2867,7 @@
               <w14:ligatures w14:val="standardContextual"/>
             </w:rPr>
           </w:pPr>
-          <w:hyperlink w:anchor="_Toc242536772" w:history="1">
+          <w:hyperlink w:anchor="_Toc242538800" w:history="1">
             <w:r>
               <w:rPr>
                 <w:rStyle w:val="Hipervnculo"/>
@@ -2891,7 +2891,7 @@
               <w:rPr>
                 <w:noProof/>
               </w:rPr>
-              <w:instrText xml:space="preserve"> PAGEREF _Toc242536772 \h </w:instrText>
+              <w:instrText xml:space="preserve"> PAGEREF _Toc242538800 \h </w:instrText>
             </w:r>
             <w:r>
               <w:rPr>
@@ -2931,7 +2931,7 @@
               <w14:ligatures w14:val="standardContextual"/>
             </w:rPr>
           </w:pPr>
-          <w:hyperlink w:anchor="_Toc242536773" w:history="1">
+          <w:hyperlink w:anchor="_Toc242538801" w:history="1">
             <w:r>
               <w:rPr>
                 <w:rStyle w:val="Hipervnculo"/>
@@ -2955,7 +2955,7 @@
               <w:rPr>
                 <w:noProof/>
               </w:rPr>
-              <w:instrText xml:space="preserve"> PAGEREF _Toc242536773 \h </w:instrText>
+              <w:instrText xml:space="preserve"> PAGEREF _Toc242538801 \h </w:instrText>
             </w:r>
             <w:r>
               <w:rPr>
@@ -3005,7 +3005,7 @@
       <w:pPr>
         <w:pStyle w:val="Ttulo1"/>
       </w:pPr>
-      <w:bookmarkStart w:id="0" w:name="_Toc242536768"/>
+      <w:bookmarkStart w:id="0" w:name="_Toc242538796"/>
       <w:r>
         <w:lastRenderedPageBreak/>
         <w:t>1. Propósito y enfoque</w:t>
@@ -3054,7 +3054,7 @@
       <w:pPr>
         <w:pStyle w:val="Ttulo1"/>
       </w:pPr>
-      <w:bookmarkStart w:id="1" w:name="_Toc242536769"/>
+      <w:bookmarkStart w:id="1" w:name="_Toc242538797"/>
       <w:r>
         <w:t>2. Procesos del alcance en este proyecto</w:t>
       </w:r>
@@ -3102,7 +3102,7 @@
           <w:left w:w="10" w:type="dxa"/>
           <w:right w:w="10" w:type="dxa"/>
         </w:tblCellMar>
-        <w:tblLook w:val="04A0" w:firstRow="1" w:lastRow="0" w:firstColumn="1" w:lastColumn="0" w:noHBand="0" w:noVBand="1"/>
+        <w:tblLook w:val="0000" w:firstRow="0" w:lastRow="0" w:firstColumn="0" w:lastColumn="0" w:noHBand="0" w:noVBand="0"/>
       </w:tblPr>
       <w:tblGrid>
         <w:gridCol w:w="1933"/>
@@ -3979,7 +3979,7 @@
       <w:pPr>
         <w:pStyle w:val="Ttulo1"/>
       </w:pPr>
-      <w:bookmarkStart w:id="2" w:name="_Toc242536770"/>
+      <w:bookmarkStart w:id="2" w:name="_Toc242538798"/>
       <w:r>
         <w:t>3. Gestión de los requisitos</w:t>
       </w:r>
@@ -4079,7 +4079,7 @@
           <w:left w:w="10" w:type="dxa"/>
           <w:right w:w="10" w:type="dxa"/>
         </w:tblCellMar>
-        <w:tblLook w:val="04A0" w:firstRow="1" w:lastRow="0" w:firstColumn="1" w:lastColumn="0" w:noHBand="0" w:noVBand="1"/>
+        <w:tblLook w:val="0000" w:firstRow="0" w:lastRow="0" w:firstColumn="0" w:lastColumn="0" w:noHBand="0" w:noVBand="0"/>
       </w:tblPr>
       <w:tblGrid>
         <w:gridCol w:w="2108"/>
@@ -4518,7 +4518,7 @@
       <w:pPr>
         <w:pStyle w:val="Ttulo1"/>
       </w:pPr>
-      <w:bookmarkStart w:id="3" w:name="_Toc242536771"/>
+      <w:bookmarkStart w:id="3" w:name="_Toc242538799"/>
       <w:r>
         <w:t>4. Métricas del alcance</w:t>
       </w:r>
@@ -4566,7 +4566,7 @@
           <w:left w:w="10" w:type="dxa"/>
           <w:right w:w="10" w:type="dxa"/>
         </w:tblCellMar>
-        <w:tblLook w:val="04A0" w:firstRow="1" w:lastRow="0" w:firstColumn="1" w:lastColumn="0" w:noHBand="0" w:noVBand="1"/>
+        <w:tblLook w:val="0000" w:firstRow="0" w:lastRow="0" w:firstColumn="0" w:lastColumn="0" w:noHBand="0" w:noVBand="0"/>
       </w:tblPr>
       <w:tblGrid>
         <w:gridCol w:w="2108"/>
@@ -5586,7 +5586,7 @@
       <w:pPr>
         <w:pStyle w:val="Ttulo1"/>
       </w:pPr>
-      <w:bookmarkStart w:id="4" w:name="_Toc242536772"/>
+      <w:bookmarkStart w:id="4" w:name="_Toc242538800"/>
       <w:r>
         <w:t>5. Línea base del alcance</w:t>
       </w:r>
@@ -5643,7 +5643,7 @@
           <w:left w:w="10" w:type="dxa"/>
           <w:right w:w="10" w:type="dxa"/>
         </w:tblCellMar>
-        <w:tblLook w:val="04A0" w:firstRow="1" w:lastRow="0" w:firstColumn="1" w:lastColumn="0" w:noHBand="0" w:noVBand="1"/>
+        <w:tblLook w:val="0000" w:firstRow="0" w:lastRow="0" w:firstColumn="0" w:lastColumn="0" w:noHBand="0" w:noVBand="0"/>
       </w:tblPr>
       <w:tblGrid>
         <w:gridCol w:w="2284"/>
@@ -6107,7 +6107,7 @@
       <w:pPr>
         <w:pStyle w:val="Ttulo1"/>
       </w:pPr>
-      <w:bookmarkStart w:id="5" w:name="_Toc242536773"/>
+      <w:bookmarkStart w:id="5" w:name="_Toc242538801"/>
       <w:r>
         <w:t>6. Roles</w:t>
       </w:r>
@@ -6155,7 +6155,7 @@
           <w:left w:w="10" w:type="dxa"/>
           <w:right w:w="10" w:type="dxa"/>
         </w:tblCellMar>
-        <w:tblLook w:val="04A0" w:firstRow="1" w:lastRow="0" w:firstColumn="1" w:lastColumn="0" w:noHBand="0" w:noVBand="1"/>
+        <w:tblLook w:val="0000" w:firstRow="0" w:lastRow="0" w:firstColumn="0" w:lastColumn="0" w:noHBand="0" w:noVBand="0"/>
       </w:tblPr>
       <w:tblGrid>
         <w:gridCol w:w="2636"/>
@@ -7021,10 +7021,10 @@
 <file path=word/numbering.xml><?xml version="1.0" encoding="utf-8"?>
 <w:numbering xmlns:wpc="http://schemas.microsoft.com/office/word/2010/wordprocessingCanvas" xmlns:cx="http://schemas.microsoft.com/office/drawing/2014/chartex" xmlns:cx1="http://schemas.microsoft.com/office/drawing/2015/9/8/chartex" xmlns:cx2="http://schemas.microsoft.com/office/drawing/2015/10/21/chartex" xmlns:cx3="http://schemas.microsoft.com/office/drawing/2016/5/9/chartex" xmlns:cx4="http://schemas.microsoft.com/office/drawing/2016/5/10/chartex" xmlns:cx5="http://schemas.microsoft.com/office/drawing/2016/5/11/chartex" xmlns:cx6="http://schemas.microsoft.com/office/drawing/2016/5/12/chartex" xmlns:cx7="http://schemas.microsoft.com/office/drawing/2016/5/13/chartex" xmlns:cx8="http://schemas.microsoft.com/office/drawing/2016/5/14/chartex" xmlns:mc="http://schemas.openxmlformats.org/markup-compatibility/2006" xmlns:aink="http://schemas.microsoft.com/office/drawing/2016/ink" xmlns:am3d="http://schemas.microsoft.com/office/drawing/2017/model3d" xmlns:o="urn:schemas-microsoft-com:office:office" xmlns:oel="http://schemas.microsoft.com/office/2019/extlst" xmlns:r="http://schemas.openxmlformats.org/officeDocument/2006/relationships" xmlns:m="http://schemas.openxmlformats.org/officeDocument/2006/math" xmlns:v="urn:schemas-microsoft-com:vml" xmlns:wp14="http://schemas.microsoft.com/office/word/2010/wordprocessingDrawing" xmlns:wp="http://schemas.openxmlformats.org/drawingml/2006/wordprocessingDrawing" xmlns:w10="urn:schemas-microsoft-com:office:word" xmlns:w="http://schemas.openxmlformats.org/wordprocessingml/2006/main" xmlns:w14="http://schemas.microsoft.com/office/word/2010/wordml" xmlns:w15="http://schemas.microsoft.com/office/word/2012/wordml" xmlns:w16cex="http://schemas.microsoft.com/office/word/2018/wordml/cex" xmlns:w16cid="http://schemas.microsoft.com/office/word/2016/wordml/cid" xmlns:w16="http://schemas.microsoft.com/office/word/2018/wordml" xmlns:w16du="http://schemas.microsoft.com/office/word/2023/wordml/word16du" xmlns:w16sdtdh="http://schemas.microsoft.com/office/word/2020/wordml/sdtdatahash" xmlns:w16sdtfl="http://schemas.microsoft.com/office/word/2024/wordml/sdtformatlock" xmlns:w16se="http://schemas.microsoft.com/office/word/2015/wordml/symex" xmlns:wpg="http://schemas.microsoft.com/office/word/2010/wordprocessingGroup" xmlns:wpi="http://schemas.microsoft.com/office/word/2010/wordprocessingInk" xmlns:wne="http://schemas.microsoft.com/office/word/2006/wordml" xmlns:wps="http://schemas.microsoft.com/office/word/2010/wordprocessingShape" mc:Ignorable="w14 w15 w16se w16cid w16 w16cex w16sdtdh w16sdtfl w16du wp14">
   <w:abstractNum w:abstractNumId="0" w15:restartNumberingAfterBreak="0">
-    <w:nsid w:val="11A81F80"/>
+    <w:nsid w:val="2C1D00F5"/>
     <w:multiLevelType w:val="hybridMultilevel"/>
-    <w:tmpl w:val="72BCF3C6"/>
-    <w:lvl w:ilvl="0" w:tplc="9CB2EE3C">
+    <w:tmpl w:val="EBB071D0"/>
+    <w:lvl w:ilvl="0" w:tplc="9404D292">
       <w:start w:val="1"/>
       <w:numFmt w:val="bullet"/>
       <w:lvlText w:val="●"/>
@@ -7033,7 +7033,7 @@
         <w:ind w:left="720" w:hanging="360"/>
       </w:pPr>
     </w:lvl>
-    <w:lvl w:ilvl="1" w:tplc="F50A1760">
+    <w:lvl w:ilvl="1" w:tplc="AAE82BA2">
       <w:start w:val="1"/>
       <w:numFmt w:val="bullet"/>
       <w:lvlText w:val="○"/>
@@ -7042,7 +7042,7 @@
         <w:ind w:left="1440" w:hanging="360"/>
       </w:pPr>
     </w:lvl>
-    <w:lvl w:ilvl="2" w:tplc="15D8721C">
+    <w:lvl w:ilvl="2" w:tplc="56709C98">
       <w:start w:val="1"/>
       <w:numFmt w:val="bullet"/>
       <w:lvlText w:val="■"/>
@@ -7051,7 +7051,7 @@
         <w:ind w:left="2160" w:hanging="360"/>
       </w:pPr>
     </w:lvl>
-    <w:lvl w:ilvl="3" w:tplc="23B08056">
+    <w:lvl w:ilvl="3" w:tplc="EEE08D74">
       <w:start w:val="1"/>
       <w:numFmt w:val="bullet"/>
       <w:lvlText w:val="●"/>
@@ -7060,7 +7060,7 @@
         <w:ind w:left="2880" w:hanging="360"/>
       </w:pPr>
     </w:lvl>
-    <w:lvl w:ilvl="4" w:tplc="C8445F20">
+    <w:lvl w:ilvl="4" w:tplc="333C0926">
       <w:start w:val="1"/>
       <w:numFmt w:val="bullet"/>
       <w:lvlText w:val="○"/>
@@ -7069,7 +7069,7 @@
         <w:ind w:left="3600" w:hanging="360"/>
       </w:pPr>
     </w:lvl>
-    <w:lvl w:ilvl="5" w:tplc="CFC2CF5A">
+    <w:lvl w:ilvl="5" w:tplc="3BBC1178">
       <w:start w:val="1"/>
       <w:numFmt w:val="bullet"/>
       <w:lvlText w:val="■"/>
@@ -7078,7 +7078,7 @@
         <w:ind w:left="4320" w:hanging="360"/>
       </w:pPr>
     </w:lvl>
-    <w:lvl w:ilvl="6" w:tplc="5A586630">
+    <w:lvl w:ilvl="6" w:tplc="83B40164">
       <w:start w:val="1"/>
       <w:numFmt w:val="bullet"/>
       <w:lvlText w:val="●"/>
@@ -7087,7 +7087,7 @@
         <w:ind w:left="5040" w:hanging="360"/>
       </w:pPr>
     </w:lvl>
-    <w:lvl w:ilvl="7" w:tplc="98A0C5EC">
+    <w:lvl w:ilvl="7" w:tplc="A274E7B4">
       <w:start w:val="1"/>
       <w:numFmt w:val="bullet"/>
       <w:lvlText w:val="●"/>
@@ -7096,7 +7096,7 @@
         <w:ind w:left="5760" w:hanging="360"/>
       </w:pPr>
     </w:lvl>
-    <w:lvl w:ilvl="8" w:tplc="62FCCB7C">
+    <w:lvl w:ilvl="8" w:tplc="6136DF44">
       <w:start w:val="1"/>
       <w:numFmt w:val="bullet"/>
       <w:lvlText w:val="●"/>
@@ -7107,10 +7107,64 @@
     </w:lvl>
   </w:abstractNum>
   <w:abstractNum w:abstractNumId="1" w15:restartNumberingAfterBreak="0">
-    <w:nsid w:val="2BA51CB1"/>
+    <w:nsid w:val="301A1FF1"/>
     <w:multiLevelType w:val="hybridMultilevel"/>
-    <w:tmpl w:val="F0EE80FA"/>
-    <w:lvl w:ilvl="0" w:tplc="804079CC">
+    <w:tmpl w:val="174E9406"/>
+    <w:lvl w:ilvl="0" w:tplc="24949AC4">
+      <w:start w:val="1"/>
+      <w:numFmt w:val="decimal"/>
+      <w:lvlText w:val="%1."/>
+      <w:lvlJc w:val="left"/>
+      <w:pPr>
+        <w:ind w:left="560" w:hanging="340"/>
+      </w:pPr>
+    </w:lvl>
+    <w:lvl w:ilvl="1" w:tplc="E1922F22">
+      <w:numFmt w:val="decimal"/>
+      <w:lvlText w:val=""/>
+      <w:lvlJc w:val="left"/>
+    </w:lvl>
+    <w:lvl w:ilvl="2" w:tplc="BAE6A404">
+      <w:numFmt w:val="decimal"/>
+      <w:lvlText w:val=""/>
+      <w:lvlJc w:val="left"/>
+    </w:lvl>
+    <w:lvl w:ilvl="3" w:tplc="AB44D1A8">
+      <w:numFmt w:val="decimal"/>
+      <w:lvlText w:val=""/>
+      <w:lvlJc w:val="left"/>
+    </w:lvl>
+    <w:lvl w:ilvl="4" w:tplc="AFAC0E2C">
+      <w:numFmt w:val="decimal"/>
+      <w:lvlText w:val=""/>
+      <w:lvlJc w:val="left"/>
+    </w:lvl>
+    <w:lvl w:ilvl="5" w:tplc="0FB29F00">
+      <w:numFmt w:val="decimal"/>
+      <w:lvlText w:val=""/>
+      <w:lvlJc w:val="left"/>
+    </w:lvl>
+    <w:lvl w:ilvl="6" w:tplc="55E4622E">
+      <w:numFmt w:val="decimal"/>
+      <w:lvlText w:val=""/>
+      <w:lvlJc w:val="left"/>
+    </w:lvl>
+    <w:lvl w:ilvl="7" w:tplc="EDA6A65A">
+      <w:numFmt w:val="decimal"/>
+      <w:lvlText w:val=""/>
+      <w:lvlJc w:val="left"/>
+    </w:lvl>
+    <w:lvl w:ilvl="8" w:tplc="7954E7CC">
+      <w:numFmt w:val="decimal"/>
+      <w:lvlText w:val=""/>
+      <w:lvlJc w:val="left"/>
+    </w:lvl>
+  </w:abstractNum>
+  <w:abstractNum w:abstractNumId="2" w15:restartNumberingAfterBreak="0">
+    <w:nsid w:val="5F8C3C89"/>
+    <w:multiLevelType w:val="hybridMultilevel"/>
+    <w:tmpl w:val="22B4AE76"/>
+    <w:lvl w:ilvl="0" w:tplc="6FF0A9D4">
       <w:start w:val="1"/>
       <w:numFmt w:val="bullet"/>
       <w:lvlText w:val="•"/>
@@ -7119,102 +7173,48 @@
         <w:ind w:left="560" w:hanging="280"/>
       </w:pPr>
     </w:lvl>
-    <w:lvl w:ilvl="1" w:tplc="EED62BDC">
+    <w:lvl w:ilvl="1" w:tplc="DD06E69C">
       <w:numFmt w:val="decimal"/>
       <w:lvlText w:val=""/>
       <w:lvlJc w:val="left"/>
     </w:lvl>
-    <w:lvl w:ilvl="2" w:tplc="0F709A46">
+    <w:lvl w:ilvl="2" w:tplc="7A56CFFA">
       <w:numFmt w:val="decimal"/>
       <w:lvlText w:val=""/>
       <w:lvlJc w:val="left"/>
     </w:lvl>
-    <w:lvl w:ilvl="3" w:tplc="F376959A">
+    <w:lvl w:ilvl="3" w:tplc="52E23CA4">
       <w:numFmt w:val="decimal"/>
       <w:lvlText w:val=""/>
       <w:lvlJc w:val="left"/>
     </w:lvl>
-    <w:lvl w:ilvl="4" w:tplc="C5D079EE">
+    <w:lvl w:ilvl="4" w:tplc="D64A9738">
       <w:numFmt w:val="decimal"/>
       <w:lvlText w:val=""/>
       <w:lvlJc w:val="left"/>
     </w:lvl>
-    <w:lvl w:ilvl="5" w:tplc="454A7830">
+    <w:lvl w:ilvl="5" w:tplc="A39E7736">
       <w:numFmt w:val="decimal"/>
       <w:lvlText w:val=""/>
       <w:lvlJc w:val="left"/>
     </w:lvl>
-    <w:lvl w:ilvl="6" w:tplc="3E025CC6">
+    <w:lvl w:ilvl="6" w:tplc="BA306BBC">
       <w:numFmt w:val="decimal"/>
       <w:lvlText w:val=""/>
       <w:lvlJc w:val="left"/>
     </w:lvl>
-    <w:lvl w:ilvl="7" w:tplc="811CA6A0">
+    <w:lvl w:ilvl="7" w:tplc="6AF24356">
       <w:numFmt w:val="decimal"/>
       <w:lvlText w:val=""/>
       <w:lvlJc w:val="left"/>
     </w:lvl>
-    <w:lvl w:ilvl="8" w:tplc="FA26328A">
+    <w:lvl w:ilvl="8" w:tplc="9034A9F8">
       <w:numFmt w:val="decimal"/>
       <w:lvlText w:val=""/>
       <w:lvlJc w:val="left"/>
     </w:lvl>
   </w:abstractNum>
-  <w:abstractNum w:abstractNumId="2" w15:restartNumberingAfterBreak="0">
-    <w:nsid w:val="4EC75D10"/>
-    <w:multiLevelType w:val="hybridMultilevel"/>
-    <w:tmpl w:val="E822ED96"/>
-    <w:lvl w:ilvl="0" w:tplc="3C9CB918">
-      <w:start w:val="1"/>
-      <w:numFmt w:val="decimal"/>
-      <w:lvlText w:val="%1."/>
-      <w:lvlJc w:val="left"/>
-      <w:pPr>
-        <w:ind w:left="560" w:hanging="340"/>
-      </w:pPr>
-    </w:lvl>
-    <w:lvl w:ilvl="1" w:tplc="7C205190">
-      <w:numFmt w:val="decimal"/>
-      <w:lvlText w:val=""/>
-      <w:lvlJc w:val="left"/>
-    </w:lvl>
-    <w:lvl w:ilvl="2" w:tplc="66345B2A">
-      <w:numFmt w:val="decimal"/>
-      <w:lvlText w:val=""/>
-      <w:lvlJc w:val="left"/>
-    </w:lvl>
-    <w:lvl w:ilvl="3" w:tplc="CCD4A110">
-      <w:numFmt w:val="decimal"/>
-      <w:lvlText w:val=""/>
-      <w:lvlJc w:val="left"/>
-    </w:lvl>
-    <w:lvl w:ilvl="4" w:tplc="6054EE5C">
-      <w:numFmt w:val="decimal"/>
-      <w:lvlText w:val=""/>
-      <w:lvlJc w:val="left"/>
-    </w:lvl>
-    <w:lvl w:ilvl="5" w:tplc="D07C99BE">
-      <w:numFmt w:val="decimal"/>
-      <w:lvlText w:val=""/>
-      <w:lvlJc w:val="left"/>
-    </w:lvl>
-    <w:lvl w:ilvl="6" w:tplc="BC522A98">
-      <w:numFmt w:val="decimal"/>
-      <w:lvlText w:val=""/>
-      <w:lvlJc w:val="left"/>
-    </w:lvl>
-    <w:lvl w:ilvl="7" w:tplc="72AEE86A">
-      <w:numFmt w:val="decimal"/>
-      <w:lvlText w:val=""/>
-      <w:lvlJc w:val="left"/>
-    </w:lvl>
-    <w:lvl w:ilvl="8" w:tplc="B4FE26FE">
-      <w:numFmt w:val="decimal"/>
-      <w:lvlText w:val=""/>
-      <w:lvlJc w:val="left"/>
-    </w:lvl>
-  </w:abstractNum>
-  <w:num w:numId="1" w16cid:durableId="1409763335">
+  <w:num w:numId="1" w16cid:durableId="694188027">
     <w:abstractNumId w:val="0"/>
     <w:lvlOverride w:ilvl="0">
       <w:startOverride w:val="1"/>
@@ -7807,7 +7807,7 @@
     <w:autoRedefine/>
     <w:uiPriority w:val="39"/>
     <w:unhideWhenUsed/>
-    <w:rsid w:val="00E83D13"/>
+    <w:rsid w:val="00995FF8"/>
     <w:pPr>
       <w:spacing w:after="100"/>
     </w:pPr>

</xml_diff>

<commit_message>
Acta con dos firmas y fechas concretas en el calendario de comunicaciones
- El acta de constitución queda para firma de la patrocinadora y del director
  del proyecto.
- Las comunicaciones programadas tienen día fijo: reunión de inicio el
  12/10/2026, avances semanales los viernes, entrevistas, taller, comunicado a
  apoderados y capacitación.
- El generador ya no se detiene si un Word está abierto: lo deja pendiente y avisa.

Co-Authored-By: Claude Opus 5.5 <noreply@anthropic.com>
</commit_message>
<xml_diff>
--- a/public/documentos/ALC-01-plan-de-gestion-del-alcance-y-de-los-requisitos.docx
+++ b/public/documentos/ALC-01-plan-de-gestion-del-alcance-y-de-los-requisitos.docx
@@ -18,7 +18,7 @@
           <w:left w:w="10" w:type="dxa"/>
           <w:right w:w="10" w:type="dxa"/>
         </w:tblCellMar>
-        <w:tblLook w:val="0000" w:firstRow="0" w:lastRow="0" w:firstColumn="0" w:lastColumn="0" w:noHBand="0" w:noVBand="0"/>
+        <w:tblLook w:val="04A0" w:firstRow="1" w:lastRow="0" w:firstColumn="1" w:lastColumn="0" w:noHBand="0" w:noVBand="1"/>
       </w:tblPr>
       <w:tblGrid>
         <w:gridCol w:w="1757"/>
@@ -52,7 +52,7 @@
                 <w:noProof/>
               </w:rPr>
               <w:drawing>
-                <wp:inline distT="0" distB="0" distL="0" distR="0" wp14:anchorId="488D5AEC" wp14:editId="71E5DF15">
+                <wp:inline distT="0" distB="0" distL="0" distR="0" wp14:anchorId="5D01379F" wp14:editId="12BFAF0C">
                   <wp:extent cx="990600" cy="990600"/>
                   <wp:effectExtent l="0" t="0" r="0" b="0"/>
                   <wp:docPr id="1" name="Imagen 1"/>
@@ -171,10 +171,10 @@
                 <w:noProof/>
               </w:rPr>
               <w:drawing>
-                <wp:inline distT="0" distB="0" distL="0" distR="0" wp14:anchorId="1AAC102F" wp14:editId="55F58FBF">
+                <wp:inline distT="0" distB="0" distL="0" distR="0" wp14:anchorId="5EAB227E" wp14:editId="66573262">
                   <wp:extent cx="800100" cy="800100"/>
                   <wp:effectExtent l="0" t="0" r="0" b="0"/>
-                  <wp:docPr id="986558357" name="Imagen 986558357"/>
+                  <wp:docPr id="135727387" name="Imagen 135727387"/>
                   <wp:cNvGraphicFramePr>
                     <a:graphicFrameLocks xmlns:a="http://schemas.openxmlformats.org/drawingml/2006/main" noChangeAspect="1"/>
                   </wp:cNvGraphicFramePr>
@@ -308,7 +308,7 @@
           <w:left w:w="10" w:type="dxa"/>
           <w:right w:w="10" w:type="dxa"/>
         </w:tblCellMar>
-        <w:tblLook w:val="0000" w:firstRow="0" w:lastRow="0" w:firstColumn="0" w:lastColumn="0" w:noHBand="0" w:noVBand="0"/>
+        <w:tblLook w:val="04A0" w:firstRow="1" w:lastRow="0" w:firstColumn="1" w:lastColumn="0" w:noHBand="0" w:noVBand="1"/>
       </w:tblPr>
       <w:tblGrid>
         <w:gridCol w:w="2636"/>
@@ -786,7 +786,7 @@
           <w:left w:w="10" w:type="dxa"/>
           <w:right w:w="10" w:type="dxa"/>
         </w:tblCellMar>
-        <w:tblLook w:val="0000" w:firstRow="0" w:lastRow="0" w:firstColumn="0" w:lastColumn="0" w:noHBand="0" w:noVBand="0"/>
+        <w:tblLook w:val="04A0" w:firstRow="1" w:lastRow="0" w:firstColumn="1" w:lastColumn="0" w:noHBand="0" w:noVBand="1"/>
       </w:tblPr>
       <w:tblGrid>
         <w:gridCol w:w="4042"/>
@@ -1399,7 +1399,7 @@
           <w:left w:w="10" w:type="dxa"/>
           <w:right w:w="10" w:type="dxa"/>
         </w:tblCellMar>
-        <w:tblLook w:val="0000" w:firstRow="0" w:lastRow="0" w:firstColumn="0" w:lastColumn="0" w:noHBand="0" w:noVBand="0"/>
+        <w:tblLook w:val="04A0" w:firstRow="1" w:lastRow="0" w:firstColumn="1" w:lastColumn="0" w:noHBand="0" w:noVBand="1"/>
       </w:tblPr>
       <w:tblGrid>
         <w:gridCol w:w="2636"/>
@@ -1817,7 +1817,7 @@
           <w:left w:w="10" w:type="dxa"/>
           <w:right w:w="10" w:type="dxa"/>
         </w:tblCellMar>
-        <w:tblLook w:val="0000" w:firstRow="0" w:lastRow="0" w:firstColumn="0" w:lastColumn="0" w:noHBand="0" w:noVBand="0"/>
+        <w:tblLook w:val="04A0" w:firstRow="1" w:lastRow="0" w:firstColumn="1" w:lastColumn="0" w:noHBand="0" w:noVBand="1"/>
       </w:tblPr>
       <w:tblGrid>
         <w:gridCol w:w="1054"/>
@@ -2158,7 +2158,7 @@
           <w:left w:w="10" w:type="dxa"/>
           <w:right w:w="10" w:type="dxa"/>
         </w:tblCellMar>
-        <w:tblLook w:val="0000" w:firstRow="0" w:lastRow="0" w:firstColumn="0" w:lastColumn="0" w:noHBand="0" w:noVBand="0"/>
+        <w:tblLook w:val="04A0" w:firstRow="1" w:lastRow="0" w:firstColumn="1" w:lastColumn="0" w:noHBand="0" w:noVBand="1"/>
       </w:tblPr>
       <w:tblGrid>
         <w:gridCol w:w="2636"/>
@@ -2498,7 +2498,7 @@
           <w:left w:w="10" w:type="dxa"/>
           <w:right w:w="10" w:type="dxa"/>
         </w:tblCellMar>
-        <w:tblLook w:val="0000" w:firstRow="0" w:lastRow="0" w:firstColumn="0" w:lastColumn="0" w:noHBand="0" w:noVBand="0"/>
+        <w:tblLook w:val="04A0" w:firstRow="1" w:lastRow="0" w:firstColumn="1" w:lastColumn="0" w:noHBand="0" w:noVBand="1"/>
       </w:tblPr>
       <w:tblGrid>
         <w:gridCol w:w="8787"/>
@@ -2585,7 +2585,7 @@
     <w:sdt>
       <w:sdtPr>
         <w:alias w:val="Contenido"/>
-        <w:id w:val="489909551"/>
+        <w:id w:val="543186445"/>
       </w:sdtPr>
       <w:sdtEndPr/>
       <w:sdtContent>
@@ -2611,7 +2611,7 @@
           <w:r>
             <w:fldChar w:fldCharType="separate"/>
           </w:r>
-          <w:hyperlink w:anchor="_Toc242538796" w:history="1">
+          <w:hyperlink w:anchor="_Toc242540370" w:history="1">
             <w:r>
               <w:rPr>
                 <w:rStyle w:val="Hipervnculo"/>
@@ -2635,7 +2635,7 @@
               <w:rPr>
                 <w:noProof/>
               </w:rPr>
-              <w:instrText xml:space="preserve"> PAGEREF _Toc242538796 \h </w:instrText>
+              <w:instrText xml:space="preserve"> PAGEREF _Toc242540370 \h </w:instrText>
             </w:r>
             <w:r>
               <w:rPr>
@@ -2675,7 +2675,7 @@
               <w14:ligatures w14:val="standardContextual"/>
             </w:rPr>
           </w:pPr>
-          <w:hyperlink w:anchor="_Toc242538797" w:history="1">
+          <w:hyperlink w:anchor="_Toc242540371" w:history="1">
             <w:r>
               <w:rPr>
                 <w:rStyle w:val="Hipervnculo"/>
@@ -2699,7 +2699,7 @@
               <w:rPr>
                 <w:noProof/>
               </w:rPr>
-              <w:instrText xml:space="preserve"> PAGEREF _Toc242538797 \h </w:instrText>
+              <w:instrText xml:space="preserve"> PAGEREF _Toc242540371 \h </w:instrText>
             </w:r>
             <w:r>
               <w:rPr>
@@ -2739,7 +2739,7 @@
               <w14:ligatures w14:val="standardContextual"/>
             </w:rPr>
           </w:pPr>
-          <w:hyperlink w:anchor="_Toc242538798" w:history="1">
+          <w:hyperlink w:anchor="_Toc242540372" w:history="1">
             <w:r>
               <w:rPr>
                 <w:rStyle w:val="Hipervnculo"/>
@@ -2763,7 +2763,7 @@
               <w:rPr>
                 <w:noProof/>
               </w:rPr>
-              <w:instrText xml:space="preserve"> PAGEREF _Toc242538798 \h </w:instrText>
+              <w:instrText xml:space="preserve"> PAGEREF _Toc242540372 \h </w:instrText>
             </w:r>
             <w:r>
               <w:rPr>
@@ -2803,7 +2803,7 @@
               <w14:ligatures w14:val="standardContextual"/>
             </w:rPr>
           </w:pPr>
-          <w:hyperlink w:anchor="_Toc242538799" w:history="1">
+          <w:hyperlink w:anchor="_Toc242540373" w:history="1">
             <w:r>
               <w:rPr>
                 <w:rStyle w:val="Hipervnculo"/>
@@ -2827,7 +2827,7 @@
               <w:rPr>
                 <w:noProof/>
               </w:rPr>
-              <w:instrText xml:space="preserve"> PAGEREF _Toc242538799 \h </w:instrText>
+              <w:instrText xml:space="preserve"> PAGEREF _Toc242540373 \h </w:instrText>
             </w:r>
             <w:r>
               <w:rPr>
@@ -2867,7 +2867,7 @@
               <w14:ligatures w14:val="standardContextual"/>
             </w:rPr>
           </w:pPr>
-          <w:hyperlink w:anchor="_Toc242538800" w:history="1">
+          <w:hyperlink w:anchor="_Toc242540374" w:history="1">
             <w:r>
               <w:rPr>
                 <w:rStyle w:val="Hipervnculo"/>
@@ -2891,7 +2891,7 @@
               <w:rPr>
                 <w:noProof/>
               </w:rPr>
-              <w:instrText xml:space="preserve"> PAGEREF _Toc242538800 \h </w:instrText>
+              <w:instrText xml:space="preserve"> PAGEREF _Toc242540374 \h </w:instrText>
             </w:r>
             <w:r>
               <w:rPr>
@@ -2931,7 +2931,7 @@
               <w14:ligatures w14:val="standardContextual"/>
             </w:rPr>
           </w:pPr>
-          <w:hyperlink w:anchor="_Toc242538801" w:history="1">
+          <w:hyperlink w:anchor="_Toc242540375" w:history="1">
             <w:r>
               <w:rPr>
                 <w:rStyle w:val="Hipervnculo"/>
@@ -2955,7 +2955,7 @@
               <w:rPr>
                 <w:noProof/>
               </w:rPr>
-              <w:instrText xml:space="preserve"> PAGEREF _Toc242538801 \h </w:instrText>
+              <w:instrText xml:space="preserve"> PAGEREF _Toc242540375 \h </w:instrText>
             </w:r>
             <w:r>
               <w:rPr>
@@ -3005,7 +3005,7 @@
       <w:pPr>
         <w:pStyle w:val="Ttulo1"/>
       </w:pPr>
-      <w:bookmarkStart w:id="0" w:name="_Toc242538796"/>
+      <w:bookmarkStart w:id="0" w:name="_Toc242540370"/>
       <w:r>
         <w:lastRenderedPageBreak/>
         <w:t>1. Propósito y enfoque</w:t>
@@ -3054,7 +3054,7 @@
       <w:pPr>
         <w:pStyle w:val="Ttulo1"/>
       </w:pPr>
-      <w:bookmarkStart w:id="1" w:name="_Toc242538797"/>
+      <w:bookmarkStart w:id="1" w:name="_Toc242540371"/>
       <w:r>
         <w:t>2. Procesos del alcance en este proyecto</w:t>
       </w:r>
@@ -3102,7 +3102,7 @@
           <w:left w:w="10" w:type="dxa"/>
           <w:right w:w="10" w:type="dxa"/>
         </w:tblCellMar>
-        <w:tblLook w:val="0000" w:firstRow="0" w:lastRow="0" w:firstColumn="0" w:lastColumn="0" w:noHBand="0" w:noVBand="0"/>
+        <w:tblLook w:val="04A0" w:firstRow="1" w:lastRow="0" w:firstColumn="1" w:lastColumn="0" w:noHBand="0" w:noVBand="1"/>
       </w:tblPr>
       <w:tblGrid>
         <w:gridCol w:w="1933"/>
@@ -3979,7 +3979,7 @@
       <w:pPr>
         <w:pStyle w:val="Ttulo1"/>
       </w:pPr>
-      <w:bookmarkStart w:id="2" w:name="_Toc242538798"/>
+      <w:bookmarkStart w:id="2" w:name="_Toc242540372"/>
       <w:r>
         <w:t>3. Gestión de los requisitos</w:t>
       </w:r>
@@ -4079,7 +4079,7 @@
           <w:left w:w="10" w:type="dxa"/>
           <w:right w:w="10" w:type="dxa"/>
         </w:tblCellMar>
-        <w:tblLook w:val="0000" w:firstRow="0" w:lastRow="0" w:firstColumn="0" w:lastColumn="0" w:noHBand="0" w:noVBand="0"/>
+        <w:tblLook w:val="04A0" w:firstRow="1" w:lastRow="0" w:firstColumn="1" w:lastColumn="0" w:noHBand="0" w:noVBand="1"/>
       </w:tblPr>
       <w:tblGrid>
         <w:gridCol w:w="2108"/>
@@ -4518,7 +4518,7 @@
       <w:pPr>
         <w:pStyle w:val="Ttulo1"/>
       </w:pPr>
-      <w:bookmarkStart w:id="3" w:name="_Toc242538799"/>
+      <w:bookmarkStart w:id="3" w:name="_Toc242540373"/>
       <w:r>
         <w:t>4. Métricas del alcance</w:t>
       </w:r>
@@ -4566,7 +4566,7 @@
           <w:left w:w="10" w:type="dxa"/>
           <w:right w:w="10" w:type="dxa"/>
         </w:tblCellMar>
-        <w:tblLook w:val="0000" w:firstRow="0" w:lastRow="0" w:firstColumn="0" w:lastColumn="0" w:noHBand="0" w:noVBand="0"/>
+        <w:tblLook w:val="04A0" w:firstRow="1" w:lastRow="0" w:firstColumn="1" w:lastColumn="0" w:noHBand="0" w:noVBand="1"/>
       </w:tblPr>
       <w:tblGrid>
         <w:gridCol w:w="2108"/>
@@ -5586,7 +5586,7 @@
       <w:pPr>
         <w:pStyle w:val="Ttulo1"/>
       </w:pPr>
-      <w:bookmarkStart w:id="4" w:name="_Toc242538800"/>
+      <w:bookmarkStart w:id="4" w:name="_Toc242540374"/>
       <w:r>
         <w:t>5. Línea base del alcance</w:t>
       </w:r>
@@ -5643,7 +5643,7 @@
           <w:left w:w="10" w:type="dxa"/>
           <w:right w:w="10" w:type="dxa"/>
         </w:tblCellMar>
-        <w:tblLook w:val="0000" w:firstRow="0" w:lastRow="0" w:firstColumn="0" w:lastColumn="0" w:noHBand="0" w:noVBand="0"/>
+        <w:tblLook w:val="04A0" w:firstRow="1" w:lastRow="0" w:firstColumn="1" w:lastColumn="0" w:noHBand="0" w:noVBand="1"/>
       </w:tblPr>
       <w:tblGrid>
         <w:gridCol w:w="2284"/>
@@ -6107,7 +6107,7 @@
       <w:pPr>
         <w:pStyle w:val="Ttulo1"/>
       </w:pPr>
-      <w:bookmarkStart w:id="5" w:name="_Toc242538801"/>
+      <w:bookmarkStart w:id="5" w:name="_Toc242540375"/>
       <w:r>
         <w:t>6. Roles</w:t>
       </w:r>
@@ -6155,7 +6155,7 @@
           <w:left w:w="10" w:type="dxa"/>
           <w:right w:w="10" w:type="dxa"/>
         </w:tblCellMar>
-        <w:tblLook w:val="0000" w:firstRow="0" w:lastRow="0" w:firstColumn="0" w:lastColumn="0" w:noHBand="0" w:noVBand="0"/>
+        <w:tblLook w:val="04A0" w:firstRow="1" w:lastRow="0" w:firstColumn="1" w:lastColumn="0" w:noHBand="0" w:noVBand="1"/>
       </w:tblPr>
       <w:tblGrid>
         <w:gridCol w:w="2636"/>
@@ -7021,10 +7021,118 @@
 <file path=word/numbering.xml><?xml version="1.0" encoding="utf-8"?>
 <w:numbering xmlns:wpc="http://schemas.microsoft.com/office/word/2010/wordprocessingCanvas" xmlns:cx="http://schemas.microsoft.com/office/drawing/2014/chartex" xmlns:cx1="http://schemas.microsoft.com/office/drawing/2015/9/8/chartex" xmlns:cx2="http://schemas.microsoft.com/office/drawing/2015/10/21/chartex" xmlns:cx3="http://schemas.microsoft.com/office/drawing/2016/5/9/chartex" xmlns:cx4="http://schemas.microsoft.com/office/drawing/2016/5/10/chartex" xmlns:cx5="http://schemas.microsoft.com/office/drawing/2016/5/11/chartex" xmlns:cx6="http://schemas.microsoft.com/office/drawing/2016/5/12/chartex" xmlns:cx7="http://schemas.microsoft.com/office/drawing/2016/5/13/chartex" xmlns:cx8="http://schemas.microsoft.com/office/drawing/2016/5/14/chartex" xmlns:mc="http://schemas.openxmlformats.org/markup-compatibility/2006" xmlns:aink="http://schemas.microsoft.com/office/drawing/2016/ink" xmlns:am3d="http://schemas.microsoft.com/office/drawing/2017/model3d" xmlns:o="urn:schemas-microsoft-com:office:office" xmlns:oel="http://schemas.microsoft.com/office/2019/extlst" xmlns:r="http://schemas.openxmlformats.org/officeDocument/2006/relationships" xmlns:m="http://schemas.openxmlformats.org/officeDocument/2006/math" xmlns:v="urn:schemas-microsoft-com:vml" xmlns:wp14="http://schemas.microsoft.com/office/word/2010/wordprocessingDrawing" xmlns:wp="http://schemas.openxmlformats.org/drawingml/2006/wordprocessingDrawing" xmlns:w10="urn:schemas-microsoft-com:office:word" xmlns:w="http://schemas.openxmlformats.org/wordprocessingml/2006/main" xmlns:w14="http://schemas.microsoft.com/office/word/2010/wordml" xmlns:w15="http://schemas.microsoft.com/office/word/2012/wordml" xmlns:w16cex="http://schemas.microsoft.com/office/word/2018/wordml/cex" xmlns:w16cid="http://schemas.microsoft.com/office/word/2016/wordml/cid" xmlns:w16="http://schemas.microsoft.com/office/word/2018/wordml" xmlns:w16du="http://schemas.microsoft.com/office/word/2023/wordml/word16du" xmlns:w16sdtdh="http://schemas.microsoft.com/office/word/2020/wordml/sdtdatahash" xmlns:w16sdtfl="http://schemas.microsoft.com/office/word/2024/wordml/sdtformatlock" xmlns:w16se="http://schemas.microsoft.com/office/word/2015/wordml/symex" xmlns:wpg="http://schemas.microsoft.com/office/word/2010/wordprocessingGroup" xmlns:wpi="http://schemas.microsoft.com/office/word/2010/wordprocessingInk" xmlns:wne="http://schemas.microsoft.com/office/word/2006/wordml" xmlns:wps="http://schemas.microsoft.com/office/word/2010/wordprocessingShape" mc:Ignorable="w14 w15 w16se w16cid w16 w16cex w16sdtdh w16sdtfl w16du wp14">
   <w:abstractNum w:abstractNumId="0" w15:restartNumberingAfterBreak="0">
-    <w:nsid w:val="2C1D00F5"/>
+    <w:nsid w:val="16365680"/>
     <w:multiLevelType w:val="hybridMultilevel"/>
-    <w:tmpl w:val="EBB071D0"/>
-    <w:lvl w:ilvl="0" w:tplc="9404D292">
+    <w:tmpl w:val="8214D028"/>
+    <w:lvl w:ilvl="0" w:tplc="180E378A">
+      <w:start w:val="1"/>
+      <w:numFmt w:val="bullet"/>
+      <w:lvlText w:val="•"/>
+      <w:lvlJc w:val="left"/>
+      <w:pPr>
+        <w:ind w:left="560" w:hanging="280"/>
+      </w:pPr>
+    </w:lvl>
+    <w:lvl w:ilvl="1" w:tplc="F04633A8">
+      <w:numFmt w:val="decimal"/>
+      <w:lvlText w:val=""/>
+      <w:lvlJc w:val="left"/>
+    </w:lvl>
+    <w:lvl w:ilvl="2" w:tplc="39E20398">
+      <w:numFmt w:val="decimal"/>
+      <w:lvlText w:val=""/>
+      <w:lvlJc w:val="left"/>
+    </w:lvl>
+    <w:lvl w:ilvl="3" w:tplc="4184B85E">
+      <w:numFmt w:val="decimal"/>
+      <w:lvlText w:val=""/>
+      <w:lvlJc w:val="left"/>
+    </w:lvl>
+    <w:lvl w:ilvl="4" w:tplc="7660A0D8">
+      <w:numFmt w:val="decimal"/>
+      <w:lvlText w:val=""/>
+      <w:lvlJc w:val="left"/>
+    </w:lvl>
+    <w:lvl w:ilvl="5" w:tplc="1EAE84FE">
+      <w:numFmt w:val="decimal"/>
+      <w:lvlText w:val=""/>
+      <w:lvlJc w:val="left"/>
+    </w:lvl>
+    <w:lvl w:ilvl="6" w:tplc="A1527448">
+      <w:numFmt w:val="decimal"/>
+      <w:lvlText w:val=""/>
+      <w:lvlJc w:val="left"/>
+    </w:lvl>
+    <w:lvl w:ilvl="7" w:tplc="8CBA1FE2">
+      <w:numFmt w:val="decimal"/>
+      <w:lvlText w:val=""/>
+      <w:lvlJc w:val="left"/>
+    </w:lvl>
+    <w:lvl w:ilvl="8" w:tplc="65B2CF2E">
+      <w:numFmt w:val="decimal"/>
+      <w:lvlText w:val=""/>
+      <w:lvlJc w:val="left"/>
+    </w:lvl>
+  </w:abstractNum>
+  <w:abstractNum w:abstractNumId="1" w15:restartNumberingAfterBreak="0">
+    <w:nsid w:val="27261750"/>
+    <w:multiLevelType w:val="hybridMultilevel"/>
+    <w:tmpl w:val="0240B0F0"/>
+    <w:lvl w:ilvl="0" w:tplc="760E71B0">
+      <w:start w:val="1"/>
+      <w:numFmt w:val="decimal"/>
+      <w:lvlText w:val="%1."/>
+      <w:lvlJc w:val="left"/>
+      <w:pPr>
+        <w:ind w:left="560" w:hanging="340"/>
+      </w:pPr>
+    </w:lvl>
+    <w:lvl w:ilvl="1" w:tplc="DB4204D8">
+      <w:numFmt w:val="decimal"/>
+      <w:lvlText w:val=""/>
+      <w:lvlJc w:val="left"/>
+    </w:lvl>
+    <w:lvl w:ilvl="2" w:tplc="44E208B2">
+      <w:numFmt w:val="decimal"/>
+      <w:lvlText w:val=""/>
+      <w:lvlJc w:val="left"/>
+    </w:lvl>
+    <w:lvl w:ilvl="3" w:tplc="EF728AC6">
+      <w:numFmt w:val="decimal"/>
+      <w:lvlText w:val=""/>
+      <w:lvlJc w:val="left"/>
+    </w:lvl>
+    <w:lvl w:ilvl="4" w:tplc="51164FF4">
+      <w:numFmt w:val="decimal"/>
+      <w:lvlText w:val=""/>
+      <w:lvlJc w:val="left"/>
+    </w:lvl>
+    <w:lvl w:ilvl="5" w:tplc="C20280F2">
+      <w:numFmt w:val="decimal"/>
+      <w:lvlText w:val=""/>
+      <w:lvlJc w:val="left"/>
+    </w:lvl>
+    <w:lvl w:ilvl="6" w:tplc="41ACEB98">
+      <w:numFmt w:val="decimal"/>
+      <w:lvlText w:val=""/>
+      <w:lvlJc w:val="left"/>
+    </w:lvl>
+    <w:lvl w:ilvl="7" w:tplc="CAB4032C">
+      <w:numFmt w:val="decimal"/>
+      <w:lvlText w:val=""/>
+      <w:lvlJc w:val="left"/>
+    </w:lvl>
+    <w:lvl w:ilvl="8" w:tplc="1C2C06CE">
+      <w:numFmt w:val="decimal"/>
+      <w:lvlText w:val=""/>
+      <w:lvlJc w:val="left"/>
+    </w:lvl>
+  </w:abstractNum>
+  <w:abstractNum w:abstractNumId="2" w15:restartNumberingAfterBreak="0">
+    <w:nsid w:val="7D5C006A"/>
+    <w:multiLevelType w:val="hybridMultilevel"/>
+    <w:tmpl w:val="194E3CFC"/>
+    <w:lvl w:ilvl="0" w:tplc="E3C0BFF0">
       <w:start w:val="1"/>
       <w:numFmt w:val="bullet"/>
       <w:lvlText w:val="●"/>
@@ -7033,7 +7141,7 @@
         <w:ind w:left="720" w:hanging="360"/>
       </w:pPr>
     </w:lvl>
-    <w:lvl w:ilvl="1" w:tplc="AAE82BA2">
+    <w:lvl w:ilvl="1" w:tplc="EAE85202">
       <w:start w:val="1"/>
       <w:numFmt w:val="bullet"/>
       <w:lvlText w:val="○"/>
@@ -7042,7 +7150,7 @@
         <w:ind w:left="1440" w:hanging="360"/>
       </w:pPr>
     </w:lvl>
-    <w:lvl w:ilvl="2" w:tplc="56709C98">
+    <w:lvl w:ilvl="2" w:tplc="A2840A0A">
       <w:start w:val="1"/>
       <w:numFmt w:val="bullet"/>
       <w:lvlText w:val="■"/>
@@ -7051,7 +7159,7 @@
         <w:ind w:left="2160" w:hanging="360"/>
       </w:pPr>
     </w:lvl>
-    <w:lvl w:ilvl="3" w:tplc="EEE08D74">
+    <w:lvl w:ilvl="3" w:tplc="92F08314">
       <w:start w:val="1"/>
       <w:numFmt w:val="bullet"/>
       <w:lvlText w:val="●"/>
@@ -7060,7 +7168,7 @@
         <w:ind w:left="2880" w:hanging="360"/>
       </w:pPr>
     </w:lvl>
-    <w:lvl w:ilvl="4" w:tplc="333C0926">
+    <w:lvl w:ilvl="4" w:tplc="1E1A1628">
       <w:start w:val="1"/>
       <w:numFmt w:val="bullet"/>
       <w:lvlText w:val="○"/>
@@ -7069,7 +7177,7 @@
         <w:ind w:left="3600" w:hanging="360"/>
       </w:pPr>
     </w:lvl>
-    <w:lvl w:ilvl="5" w:tplc="3BBC1178">
+    <w:lvl w:ilvl="5" w:tplc="48962A8C">
       <w:start w:val="1"/>
       <w:numFmt w:val="bullet"/>
       <w:lvlText w:val="■"/>
@@ -7078,7 +7186,7 @@
         <w:ind w:left="4320" w:hanging="360"/>
       </w:pPr>
     </w:lvl>
-    <w:lvl w:ilvl="6" w:tplc="83B40164">
+    <w:lvl w:ilvl="6" w:tplc="BD8E7C86">
       <w:start w:val="1"/>
       <w:numFmt w:val="bullet"/>
       <w:lvlText w:val="●"/>
@@ -7087,7 +7195,7 @@
         <w:ind w:left="5040" w:hanging="360"/>
       </w:pPr>
     </w:lvl>
-    <w:lvl w:ilvl="7" w:tplc="A274E7B4">
+    <w:lvl w:ilvl="7" w:tplc="9A2E69B8">
       <w:start w:val="1"/>
       <w:numFmt w:val="bullet"/>
       <w:lvlText w:val="●"/>
@@ -7096,7 +7204,7 @@
         <w:ind w:left="5760" w:hanging="360"/>
       </w:pPr>
     </w:lvl>
-    <w:lvl w:ilvl="8" w:tplc="6136DF44">
+    <w:lvl w:ilvl="8" w:tplc="43323436">
       <w:start w:val="1"/>
       <w:numFmt w:val="bullet"/>
       <w:lvlText w:val="●"/>
@@ -7106,116 +7214,8 @@
       </w:pPr>
     </w:lvl>
   </w:abstractNum>
-  <w:abstractNum w:abstractNumId="1" w15:restartNumberingAfterBreak="0">
-    <w:nsid w:val="301A1FF1"/>
-    <w:multiLevelType w:val="hybridMultilevel"/>
-    <w:tmpl w:val="174E9406"/>
-    <w:lvl w:ilvl="0" w:tplc="24949AC4">
-      <w:start w:val="1"/>
-      <w:numFmt w:val="decimal"/>
-      <w:lvlText w:val="%1."/>
-      <w:lvlJc w:val="left"/>
-      <w:pPr>
-        <w:ind w:left="560" w:hanging="340"/>
-      </w:pPr>
-    </w:lvl>
-    <w:lvl w:ilvl="1" w:tplc="E1922F22">
-      <w:numFmt w:val="decimal"/>
-      <w:lvlText w:val=""/>
-      <w:lvlJc w:val="left"/>
-    </w:lvl>
-    <w:lvl w:ilvl="2" w:tplc="BAE6A404">
-      <w:numFmt w:val="decimal"/>
-      <w:lvlText w:val=""/>
-      <w:lvlJc w:val="left"/>
-    </w:lvl>
-    <w:lvl w:ilvl="3" w:tplc="AB44D1A8">
-      <w:numFmt w:val="decimal"/>
-      <w:lvlText w:val=""/>
-      <w:lvlJc w:val="left"/>
-    </w:lvl>
-    <w:lvl w:ilvl="4" w:tplc="AFAC0E2C">
-      <w:numFmt w:val="decimal"/>
-      <w:lvlText w:val=""/>
-      <w:lvlJc w:val="left"/>
-    </w:lvl>
-    <w:lvl w:ilvl="5" w:tplc="0FB29F00">
-      <w:numFmt w:val="decimal"/>
-      <w:lvlText w:val=""/>
-      <w:lvlJc w:val="left"/>
-    </w:lvl>
-    <w:lvl w:ilvl="6" w:tplc="55E4622E">
-      <w:numFmt w:val="decimal"/>
-      <w:lvlText w:val=""/>
-      <w:lvlJc w:val="left"/>
-    </w:lvl>
-    <w:lvl w:ilvl="7" w:tplc="EDA6A65A">
-      <w:numFmt w:val="decimal"/>
-      <w:lvlText w:val=""/>
-      <w:lvlJc w:val="left"/>
-    </w:lvl>
-    <w:lvl w:ilvl="8" w:tplc="7954E7CC">
-      <w:numFmt w:val="decimal"/>
-      <w:lvlText w:val=""/>
-      <w:lvlJc w:val="left"/>
-    </w:lvl>
-  </w:abstractNum>
-  <w:abstractNum w:abstractNumId="2" w15:restartNumberingAfterBreak="0">
-    <w:nsid w:val="5F8C3C89"/>
-    <w:multiLevelType w:val="hybridMultilevel"/>
-    <w:tmpl w:val="22B4AE76"/>
-    <w:lvl w:ilvl="0" w:tplc="6FF0A9D4">
-      <w:start w:val="1"/>
-      <w:numFmt w:val="bullet"/>
-      <w:lvlText w:val="•"/>
-      <w:lvlJc w:val="left"/>
-      <w:pPr>
-        <w:ind w:left="560" w:hanging="280"/>
-      </w:pPr>
-    </w:lvl>
-    <w:lvl w:ilvl="1" w:tplc="DD06E69C">
-      <w:numFmt w:val="decimal"/>
-      <w:lvlText w:val=""/>
-      <w:lvlJc w:val="left"/>
-    </w:lvl>
-    <w:lvl w:ilvl="2" w:tplc="7A56CFFA">
-      <w:numFmt w:val="decimal"/>
-      <w:lvlText w:val=""/>
-      <w:lvlJc w:val="left"/>
-    </w:lvl>
-    <w:lvl w:ilvl="3" w:tplc="52E23CA4">
-      <w:numFmt w:val="decimal"/>
-      <w:lvlText w:val=""/>
-      <w:lvlJc w:val="left"/>
-    </w:lvl>
-    <w:lvl w:ilvl="4" w:tplc="D64A9738">
-      <w:numFmt w:val="decimal"/>
-      <w:lvlText w:val=""/>
-      <w:lvlJc w:val="left"/>
-    </w:lvl>
-    <w:lvl w:ilvl="5" w:tplc="A39E7736">
-      <w:numFmt w:val="decimal"/>
-      <w:lvlText w:val=""/>
-      <w:lvlJc w:val="left"/>
-    </w:lvl>
-    <w:lvl w:ilvl="6" w:tplc="BA306BBC">
-      <w:numFmt w:val="decimal"/>
-      <w:lvlText w:val=""/>
-      <w:lvlJc w:val="left"/>
-    </w:lvl>
-    <w:lvl w:ilvl="7" w:tplc="6AF24356">
-      <w:numFmt w:val="decimal"/>
-      <w:lvlText w:val=""/>
-      <w:lvlJc w:val="left"/>
-    </w:lvl>
-    <w:lvl w:ilvl="8" w:tplc="9034A9F8">
-      <w:numFmt w:val="decimal"/>
-      <w:lvlText w:val=""/>
-      <w:lvlJc w:val="left"/>
-    </w:lvl>
-  </w:abstractNum>
-  <w:num w:numId="1" w16cid:durableId="694188027">
-    <w:abstractNumId w:val="0"/>
+  <w:num w:numId="1" w16cid:durableId="55587731">
+    <w:abstractNumId w:val="2"/>
     <w:lvlOverride w:ilvl="0">
       <w:startOverride w:val="1"/>
     </w:lvlOverride>
@@ -7807,7 +7807,7 @@
     <w:autoRedefine/>
     <w:uiPriority w:val="39"/>
     <w:unhideWhenUsed/>
-    <w:rsid w:val="00995FF8"/>
+    <w:rsid w:val="00C11C00"/>
     <w:pPr>
       <w:spacing w:after="100"/>
     </w:pPr>

</xml_diff>

<commit_message>
Agregar el informe de avance del producto por EDT y enlazar el prototipo actual
- ALC-05: estado de los 20 paquetes de la EDT frente al prototipo, qué es real
  y qué es demostración, ajustes aplicados y guion de la demostración.
- El proceso de monitorear y controlar el alcance pasa a aplicado.
- Los registros de cambios e incidentes reflejan los ajustes del prototipo.
- La portada enlaza al prototipo vigente.

Co-Authored-By: Claude Opus 5.5 <noreply@anthropic.com>
</commit_message>
<xml_diff>
--- a/public/documentos/ALC-01-plan-de-gestion-del-alcance-y-de-los-requisitos.docx
+++ b/public/documentos/ALC-01-plan-de-gestion-del-alcance-y-de-los-requisitos.docx
@@ -52,7 +52,7 @@
                 <w:noProof/>
               </w:rPr>
               <w:drawing>
-                <wp:inline distT="0" distB="0" distL="0" distR="0" wp14:anchorId="5D01379F" wp14:editId="12BFAF0C">
+                <wp:inline distT="0" distB="0" distL="0" distR="0" wp14:anchorId="4507D6A1" wp14:editId="58C1A90A">
                   <wp:extent cx="990600" cy="990600"/>
                   <wp:effectExtent l="0" t="0" r="0" b="0"/>
                   <wp:docPr id="1" name="Imagen 1"/>
@@ -171,10 +171,10 @@
                 <w:noProof/>
               </w:rPr>
               <w:drawing>
-                <wp:inline distT="0" distB="0" distL="0" distR="0" wp14:anchorId="5EAB227E" wp14:editId="66573262">
+                <wp:inline distT="0" distB="0" distL="0" distR="0" wp14:anchorId="187EDA93" wp14:editId="5593E921">
                   <wp:extent cx="800100" cy="800100"/>
                   <wp:effectExtent l="0" t="0" r="0" b="0"/>
-                  <wp:docPr id="135727387" name="Imagen 135727387"/>
+                  <wp:docPr id="2012690453" name="Imagen 2012690453"/>
                   <wp:cNvGraphicFramePr>
                     <a:graphicFrameLocks xmlns:a="http://schemas.openxmlformats.org/drawingml/2006/main" noChangeAspect="1"/>
                   </wp:cNvGraphicFramePr>
@@ -2585,7 +2585,7 @@
     <w:sdt>
       <w:sdtPr>
         <w:alias w:val="Contenido"/>
-        <w:id w:val="543186445"/>
+        <w:id w:val="901722024"/>
       </w:sdtPr>
       <w:sdtEndPr/>
       <w:sdtContent>
@@ -2611,7 +2611,7 @@
           <w:r>
             <w:fldChar w:fldCharType="separate"/>
           </w:r>
-          <w:hyperlink w:anchor="_Toc242540370" w:history="1">
+          <w:hyperlink w:anchor="_Toc242543450" w:history="1">
             <w:r>
               <w:rPr>
                 <w:rStyle w:val="Hipervnculo"/>
@@ -2635,7 +2635,7 @@
               <w:rPr>
                 <w:noProof/>
               </w:rPr>
-              <w:instrText xml:space="preserve"> PAGEREF _Toc242540370 \h </w:instrText>
+              <w:instrText xml:space="preserve"> PAGEREF _Toc242543450 \h </w:instrText>
             </w:r>
             <w:r>
               <w:rPr>
@@ -2675,7 +2675,7 @@
               <w14:ligatures w14:val="standardContextual"/>
             </w:rPr>
           </w:pPr>
-          <w:hyperlink w:anchor="_Toc242540371" w:history="1">
+          <w:hyperlink w:anchor="_Toc242543451" w:history="1">
             <w:r>
               <w:rPr>
                 <w:rStyle w:val="Hipervnculo"/>
@@ -2699,7 +2699,7 @@
               <w:rPr>
                 <w:noProof/>
               </w:rPr>
-              <w:instrText xml:space="preserve"> PAGEREF _Toc242540371 \h </w:instrText>
+              <w:instrText xml:space="preserve"> PAGEREF _Toc242543451 \h </w:instrText>
             </w:r>
             <w:r>
               <w:rPr>
@@ -2739,7 +2739,7 @@
               <w14:ligatures w14:val="standardContextual"/>
             </w:rPr>
           </w:pPr>
-          <w:hyperlink w:anchor="_Toc242540372" w:history="1">
+          <w:hyperlink w:anchor="_Toc242543452" w:history="1">
             <w:r>
               <w:rPr>
                 <w:rStyle w:val="Hipervnculo"/>
@@ -2763,7 +2763,7 @@
               <w:rPr>
                 <w:noProof/>
               </w:rPr>
-              <w:instrText xml:space="preserve"> PAGEREF _Toc242540372 \h </w:instrText>
+              <w:instrText xml:space="preserve"> PAGEREF _Toc242543452 \h </w:instrText>
             </w:r>
             <w:r>
               <w:rPr>
@@ -2803,7 +2803,7 @@
               <w14:ligatures w14:val="standardContextual"/>
             </w:rPr>
           </w:pPr>
-          <w:hyperlink w:anchor="_Toc242540373" w:history="1">
+          <w:hyperlink w:anchor="_Toc242543453" w:history="1">
             <w:r>
               <w:rPr>
                 <w:rStyle w:val="Hipervnculo"/>
@@ -2827,7 +2827,7 @@
               <w:rPr>
                 <w:noProof/>
               </w:rPr>
-              <w:instrText xml:space="preserve"> PAGEREF _Toc242540373 \h </w:instrText>
+              <w:instrText xml:space="preserve"> PAGEREF _Toc242543453 \h </w:instrText>
             </w:r>
             <w:r>
               <w:rPr>
@@ -2867,7 +2867,7 @@
               <w14:ligatures w14:val="standardContextual"/>
             </w:rPr>
           </w:pPr>
-          <w:hyperlink w:anchor="_Toc242540374" w:history="1">
+          <w:hyperlink w:anchor="_Toc242543454" w:history="1">
             <w:r>
               <w:rPr>
                 <w:rStyle w:val="Hipervnculo"/>
@@ -2891,7 +2891,7 @@
               <w:rPr>
                 <w:noProof/>
               </w:rPr>
-              <w:instrText xml:space="preserve"> PAGEREF _Toc242540374 \h </w:instrText>
+              <w:instrText xml:space="preserve"> PAGEREF _Toc242543454 \h </w:instrText>
             </w:r>
             <w:r>
               <w:rPr>
@@ -2931,7 +2931,7 @@
               <w14:ligatures w14:val="standardContextual"/>
             </w:rPr>
           </w:pPr>
-          <w:hyperlink w:anchor="_Toc242540375" w:history="1">
+          <w:hyperlink w:anchor="_Toc242543455" w:history="1">
             <w:r>
               <w:rPr>
                 <w:rStyle w:val="Hipervnculo"/>
@@ -2955,7 +2955,7 @@
               <w:rPr>
                 <w:noProof/>
               </w:rPr>
-              <w:instrText xml:space="preserve"> PAGEREF _Toc242540375 \h </w:instrText>
+              <w:instrText xml:space="preserve"> PAGEREF _Toc242543455 \h </w:instrText>
             </w:r>
             <w:r>
               <w:rPr>
@@ -3005,7 +3005,7 @@
       <w:pPr>
         <w:pStyle w:val="Ttulo1"/>
       </w:pPr>
-      <w:bookmarkStart w:id="0" w:name="_Toc242540370"/>
+      <w:bookmarkStart w:id="0" w:name="_Toc242543450"/>
       <w:r>
         <w:lastRenderedPageBreak/>
         <w:t>1. Propósito y enfoque</w:t>
@@ -3054,7 +3054,7 @@
       <w:pPr>
         <w:pStyle w:val="Ttulo1"/>
       </w:pPr>
-      <w:bookmarkStart w:id="1" w:name="_Toc242540371"/>
+      <w:bookmarkStart w:id="1" w:name="_Toc242543451"/>
       <w:r>
         <w:t>2. Procesos del alcance en este proyecto</w:t>
       </w:r>
@@ -3979,7 +3979,7 @@
       <w:pPr>
         <w:pStyle w:val="Ttulo1"/>
       </w:pPr>
-      <w:bookmarkStart w:id="2" w:name="_Toc242540372"/>
+      <w:bookmarkStart w:id="2" w:name="_Toc242543452"/>
       <w:r>
         <w:t>3. Gestión de los requisitos</w:t>
       </w:r>
@@ -4518,7 +4518,7 @@
       <w:pPr>
         <w:pStyle w:val="Ttulo1"/>
       </w:pPr>
-      <w:bookmarkStart w:id="3" w:name="_Toc242540373"/>
+      <w:bookmarkStart w:id="3" w:name="_Toc242543453"/>
       <w:r>
         <w:t>4. Métricas del alcance</w:t>
       </w:r>
@@ -5586,7 +5586,7 @@
       <w:pPr>
         <w:pStyle w:val="Ttulo1"/>
       </w:pPr>
-      <w:bookmarkStart w:id="4" w:name="_Toc242540374"/>
+      <w:bookmarkStart w:id="4" w:name="_Toc242543454"/>
       <w:r>
         <w:t>5. Línea base del alcance</w:t>
       </w:r>
@@ -6107,7 +6107,7 @@
       <w:pPr>
         <w:pStyle w:val="Ttulo1"/>
       </w:pPr>
-      <w:bookmarkStart w:id="5" w:name="_Toc242540375"/>
+      <w:bookmarkStart w:id="5" w:name="_Toc242543455"/>
       <w:r>
         <w:t>6. Roles</w:t>
       </w:r>
@@ -7021,118 +7021,10 @@
 <file path=word/numbering.xml><?xml version="1.0" encoding="utf-8"?>
 <w:numbering xmlns:wpc="http://schemas.microsoft.com/office/word/2010/wordprocessingCanvas" xmlns:cx="http://schemas.microsoft.com/office/drawing/2014/chartex" xmlns:cx1="http://schemas.microsoft.com/office/drawing/2015/9/8/chartex" xmlns:cx2="http://schemas.microsoft.com/office/drawing/2015/10/21/chartex" xmlns:cx3="http://schemas.microsoft.com/office/drawing/2016/5/9/chartex" xmlns:cx4="http://schemas.microsoft.com/office/drawing/2016/5/10/chartex" xmlns:cx5="http://schemas.microsoft.com/office/drawing/2016/5/11/chartex" xmlns:cx6="http://schemas.microsoft.com/office/drawing/2016/5/12/chartex" xmlns:cx7="http://schemas.microsoft.com/office/drawing/2016/5/13/chartex" xmlns:cx8="http://schemas.microsoft.com/office/drawing/2016/5/14/chartex" xmlns:mc="http://schemas.openxmlformats.org/markup-compatibility/2006" xmlns:aink="http://schemas.microsoft.com/office/drawing/2016/ink" xmlns:am3d="http://schemas.microsoft.com/office/drawing/2017/model3d" xmlns:o="urn:schemas-microsoft-com:office:office" xmlns:oel="http://schemas.microsoft.com/office/2019/extlst" xmlns:r="http://schemas.openxmlformats.org/officeDocument/2006/relationships" xmlns:m="http://schemas.openxmlformats.org/officeDocument/2006/math" xmlns:v="urn:schemas-microsoft-com:vml" xmlns:wp14="http://schemas.microsoft.com/office/word/2010/wordprocessingDrawing" xmlns:wp="http://schemas.openxmlformats.org/drawingml/2006/wordprocessingDrawing" xmlns:w10="urn:schemas-microsoft-com:office:word" xmlns:w="http://schemas.openxmlformats.org/wordprocessingml/2006/main" xmlns:w14="http://schemas.microsoft.com/office/word/2010/wordml" xmlns:w15="http://schemas.microsoft.com/office/word/2012/wordml" xmlns:w16cex="http://schemas.microsoft.com/office/word/2018/wordml/cex" xmlns:w16cid="http://schemas.microsoft.com/office/word/2016/wordml/cid" xmlns:w16="http://schemas.microsoft.com/office/word/2018/wordml" xmlns:w16du="http://schemas.microsoft.com/office/word/2023/wordml/word16du" xmlns:w16sdtdh="http://schemas.microsoft.com/office/word/2020/wordml/sdtdatahash" xmlns:w16sdtfl="http://schemas.microsoft.com/office/word/2024/wordml/sdtformatlock" xmlns:w16se="http://schemas.microsoft.com/office/word/2015/wordml/symex" xmlns:wpg="http://schemas.microsoft.com/office/word/2010/wordprocessingGroup" xmlns:wpi="http://schemas.microsoft.com/office/word/2010/wordprocessingInk" xmlns:wne="http://schemas.microsoft.com/office/word/2006/wordml" xmlns:wps="http://schemas.microsoft.com/office/word/2010/wordprocessingShape" mc:Ignorable="w14 w15 w16se w16cid w16 w16cex w16sdtdh w16sdtfl w16du wp14">
   <w:abstractNum w:abstractNumId="0" w15:restartNumberingAfterBreak="0">
-    <w:nsid w:val="16365680"/>
+    <w:nsid w:val="0DAD59B5"/>
     <w:multiLevelType w:val="hybridMultilevel"/>
-    <w:tmpl w:val="8214D028"/>
-    <w:lvl w:ilvl="0" w:tplc="180E378A">
-      <w:start w:val="1"/>
-      <w:numFmt w:val="bullet"/>
-      <w:lvlText w:val="•"/>
-      <w:lvlJc w:val="left"/>
-      <w:pPr>
-        <w:ind w:left="560" w:hanging="280"/>
-      </w:pPr>
-    </w:lvl>
-    <w:lvl w:ilvl="1" w:tplc="F04633A8">
-      <w:numFmt w:val="decimal"/>
-      <w:lvlText w:val=""/>
-      <w:lvlJc w:val="left"/>
-    </w:lvl>
-    <w:lvl w:ilvl="2" w:tplc="39E20398">
-      <w:numFmt w:val="decimal"/>
-      <w:lvlText w:val=""/>
-      <w:lvlJc w:val="left"/>
-    </w:lvl>
-    <w:lvl w:ilvl="3" w:tplc="4184B85E">
-      <w:numFmt w:val="decimal"/>
-      <w:lvlText w:val=""/>
-      <w:lvlJc w:val="left"/>
-    </w:lvl>
-    <w:lvl w:ilvl="4" w:tplc="7660A0D8">
-      <w:numFmt w:val="decimal"/>
-      <w:lvlText w:val=""/>
-      <w:lvlJc w:val="left"/>
-    </w:lvl>
-    <w:lvl w:ilvl="5" w:tplc="1EAE84FE">
-      <w:numFmt w:val="decimal"/>
-      <w:lvlText w:val=""/>
-      <w:lvlJc w:val="left"/>
-    </w:lvl>
-    <w:lvl w:ilvl="6" w:tplc="A1527448">
-      <w:numFmt w:val="decimal"/>
-      <w:lvlText w:val=""/>
-      <w:lvlJc w:val="left"/>
-    </w:lvl>
-    <w:lvl w:ilvl="7" w:tplc="8CBA1FE2">
-      <w:numFmt w:val="decimal"/>
-      <w:lvlText w:val=""/>
-      <w:lvlJc w:val="left"/>
-    </w:lvl>
-    <w:lvl w:ilvl="8" w:tplc="65B2CF2E">
-      <w:numFmt w:val="decimal"/>
-      <w:lvlText w:val=""/>
-      <w:lvlJc w:val="left"/>
-    </w:lvl>
-  </w:abstractNum>
-  <w:abstractNum w:abstractNumId="1" w15:restartNumberingAfterBreak="0">
-    <w:nsid w:val="27261750"/>
-    <w:multiLevelType w:val="hybridMultilevel"/>
-    <w:tmpl w:val="0240B0F0"/>
-    <w:lvl w:ilvl="0" w:tplc="760E71B0">
-      <w:start w:val="1"/>
-      <w:numFmt w:val="decimal"/>
-      <w:lvlText w:val="%1."/>
-      <w:lvlJc w:val="left"/>
-      <w:pPr>
-        <w:ind w:left="560" w:hanging="340"/>
-      </w:pPr>
-    </w:lvl>
-    <w:lvl w:ilvl="1" w:tplc="DB4204D8">
-      <w:numFmt w:val="decimal"/>
-      <w:lvlText w:val=""/>
-      <w:lvlJc w:val="left"/>
-    </w:lvl>
-    <w:lvl w:ilvl="2" w:tplc="44E208B2">
-      <w:numFmt w:val="decimal"/>
-      <w:lvlText w:val=""/>
-      <w:lvlJc w:val="left"/>
-    </w:lvl>
-    <w:lvl w:ilvl="3" w:tplc="EF728AC6">
-      <w:numFmt w:val="decimal"/>
-      <w:lvlText w:val=""/>
-      <w:lvlJc w:val="left"/>
-    </w:lvl>
-    <w:lvl w:ilvl="4" w:tplc="51164FF4">
-      <w:numFmt w:val="decimal"/>
-      <w:lvlText w:val=""/>
-      <w:lvlJc w:val="left"/>
-    </w:lvl>
-    <w:lvl w:ilvl="5" w:tplc="C20280F2">
-      <w:numFmt w:val="decimal"/>
-      <w:lvlText w:val=""/>
-      <w:lvlJc w:val="left"/>
-    </w:lvl>
-    <w:lvl w:ilvl="6" w:tplc="41ACEB98">
-      <w:numFmt w:val="decimal"/>
-      <w:lvlText w:val=""/>
-      <w:lvlJc w:val="left"/>
-    </w:lvl>
-    <w:lvl w:ilvl="7" w:tplc="CAB4032C">
-      <w:numFmt w:val="decimal"/>
-      <w:lvlText w:val=""/>
-      <w:lvlJc w:val="left"/>
-    </w:lvl>
-    <w:lvl w:ilvl="8" w:tplc="1C2C06CE">
-      <w:numFmt w:val="decimal"/>
-      <w:lvlText w:val=""/>
-      <w:lvlJc w:val="left"/>
-    </w:lvl>
-  </w:abstractNum>
-  <w:abstractNum w:abstractNumId="2" w15:restartNumberingAfterBreak="0">
-    <w:nsid w:val="7D5C006A"/>
-    <w:multiLevelType w:val="hybridMultilevel"/>
-    <w:tmpl w:val="194E3CFC"/>
-    <w:lvl w:ilvl="0" w:tplc="E3C0BFF0">
+    <w:tmpl w:val="9826617E"/>
+    <w:lvl w:ilvl="0" w:tplc="AB9C238E">
       <w:start w:val="1"/>
       <w:numFmt w:val="bullet"/>
       <w:lvlText w:val="●"/>
@@ -7141,7 +7033,7 @@
         <w:ind w:left="720" w:hanging="360"/>
       </w:pPr>
     </w:lvl>
-    <w:lvl w:ilvl="1" w:tplc="EAE85202">
+    <w:lvl w:ilvl="1" w:tplc="4944228E">
       <w:start w:val="1"/>
       <w:numFmt w:val="bullet"/>
       <w:lvlText w:val="○"/>
@@ -7150,7 +7042,7 @@
         <w:ind w:left="1440" w:hanging="360"/>
       </w:pPr>
     </w:lvl>
-    <w:lvl w:ilvl="2" w:tplc="A2840A0A">
+    <w:lvl w:ilvl="2" w:tplc="23385C12">
       <w:start w:val="1"/>
       <w:numFmt w:val="bullet"/>
       <w:lvlText w:val="■"/>
@@ -7159,7 +7051,7 @@
         <w:ind w:left="2160" w:hanging="360"/>
       </w:pPr>
     </w:lvl>
-    <w:lvl w:ilvl="3" w:tplc="92F08314">
+    <w:lvl w:ilvl="3" w:tplc="A7306AEE">
       <w:start w:val="1"/>
       <w:numFmt w:val="bullet"/>
       <w:lvlText w:val="●"/>
@@ -7168,7 +7060,7 @@
         <w:ind w:left="2880" w:hanging="360"/>
       </w:pPr>
     </w:lvl>
-    <w:lvl w:ilvl="4" w:tplc="1E1A1628">
+    <w:lvl w:ilvl="4" w:tplc="B978C656">
       <w:start w:val="1"/>
       <w:numFmt w:val="bullet"/>
       <w:lvlText w:val="○"/>
@@ -7177,7 +7069,7 @@
         <w:ind w:left="3600" w:hanging="360"/>
       </w:pPr>
     </w:lvl>
-    <w:lvl w:ilvl="5" w:tplc="48962A8C">
+    <w:lvl w:ilvl="5" w:tplc="83306D2E">
       <w:start w:val="1"/>
       <w:numFmt w:val="bullet"/>
       <w:lvlText w:val="■"/>
@@ -7186,7 +7078,7 @@
         <w:ind w:left="4320" w:hanging="360"/>
       </w:pPr>
     </w:lvl>
-    <w:lvl w:ilvl="6" w:tplc="BD8E7C86">
+    <w:lvl w:ilvl="6" w:tplc="DBCA6412">
       <w:start w:val="1"/>
       <w:numFmt w:val="bullet"/>
       <w:lvlText w:val="●"/>
@@ -7195,7 +7087,7 @@
         <w:ind w:left="5040" w:hanging="360"/>
       </w:pPr>
     </w:lvl>
-    <w:lvl w:ilvl="7" w:tplc="9A2E69B8">
+    <w:lvl w:ilvl="7" w:tplc="A0B6F26A">
       <w:start w:val="1"/>
       <w:numFmt w:val="bullet"/>
       <w:lvlText w:val="●"/>
@@ -7204,7 +7096,7 @@
         <w:ind w:left="5760" w:hanging="360"/>
       </w:pPr>
     </w:lvl>
-    <w:lvl w:ilvl="8" w:tplc="43323436">
+    <w:lvl w:ilvl="8" w:tplc="812CE36C">
       <w:start w:val="1"/>
       <w:numFmt w:val="bullet"/>
       <w:lvlText w:val="●"/>
@@ -7214,8 +7106,116 @@
       </w:pPr>
     </w:lvl>
   </w:abstractNum>
-  <w:num w:numId="1" w16cid:durableId="55587731">
-    <w:abstractNumId w:val="2"/>
+  <w:abstractNum w:abstractNumId="1" w15:restartNumberingAfterBreak="0">
+    <w:nsid w:val="27AA5853"/>
+    <w:multiLevelType w:val="hybridMultilevel"/>
+    <w:tmpl w:val="7C2E8FAA"/>
+    <w:lvl w:ilvl="0" w:tplc="02BC3902">
+      <w:start w:val="1"/>
+      <w:numFmt w:val="bullet"/>
+      <w:lvlText w:val="•"/>
+      <w:lvlJc w:val="left"/>
+      <w:pPr>
+        <w:ind w:left="560" w:hanging="280"/>
+      </w:pPr>
+    </w:lvl>
+    <w:lvl w:ilvl="1" w:tplc="6BF89332">
+      <w:numFmt w:val="decimal"/>
+      <w:lvlText w:val=""/>
+      <w:lvlJc w:val="left"/>
+    </w:lvl>
+    <w:lvl w:ilvl="2" w:tplc="82DC9D38">
+      <w:numFmt w:val="decimal"/>
+      <w:lvlText w:val=""/>
+      <w:lvlJc w:val="left"/>
+    </w:lvl>
+    <w:lvl w:ilvl="3" w:tplc="E4227742">
+      <w:numFmt w:val="decimal"/>
+      <w:lvlText w:val=""/>
+      <w:lvlJc w:val="left"/>
+    </w:lvl>
+    <w:lvl w:ilvl="4" w:tplc="BBC89A4E">
+      <w:numFmt w:val="decimal"/>
+      <w:lvlText w:val=""/>
+      <w:lvlJc w:val="left"/>
+    </w:lvl>
+    <w:lvl w:ilvl="5" w:tplc="420C2640">
+      <w:numFmt w:val="decimal"/>
+      <w:lvlText w:val=""/>
+      <w:lvlJc w:val="left"/>
+    </w:lvl>
+    <w:lvl w:ilvl="6" w:tplc="E1C6164C">
+      <w:numFmt w:val="decimal"/>
+      <w:lvlText w:val=""/>
+      <w:lvlJc w:val="left"/>
+    </w:lvl>
+    <w:lvl w:ilvl="7" w:tplc="D5B2CDD0">
+      <w:numFmt w:val="decimal"/>
+      <w:lvlText w:val=""/>
+      <w:lvlJc w:val="left"/>
+    </w:lvl>
+    <w:lvl w:ilvl="8" w:tplc="245AFFD4">
+      <w:numFmt w:val="decimal"/>
+      <w:lvlText w:val=""/>
+      <w:lvlJc w:val="left"/>
+    </w:lvl>
+  </w:abstractNum>
+  <w:abstractNum w:abstractNumId="2" w15:restartNumberingAfterBreak="0">
+    <w:nsid w:val="68EF7557"/>
+    <w:multiLevelType w:val="hybridMultilevel"/>
+    <w:tmpl w:val="B5C85096"/>
+    <w:lvl w:ilvl="0" w:tplc="1C58E39A">
+      <w:start w:val="1"/>
+      <w:numFmt w:val="decimal"/>
+      <w:lvlText w:val="%1."/>
+      <w:lvlJc w:val="left"/>
+      <w:pPr>
+        <w:ind w:left="560" w:hanging="340"/>
+      </w:pPr>
+    </w:lvl>
+    <w:lvl w:ilvl="1" w:tplc="4C421584">
+      <w:numFmt w:val="decimal"/>
+      <w:lvlText w:val=""/>
+      <w:lvlJc w:val="left"/>
+    </w:lvl>
+    <w:lvl w:ilvl="2" w:tplc="DEC00EE0">
+      <w:numFmt w:val="decimal"/>
+      <w:lvlText w:val=""/>
+      <w:lvlJc w:val="left"/>
+    </w:lvl>
+    <w:lvl w:ilvl="3" w:tplc="16AAEC26">
+      <w:numFmt w:val="decimal"/>
+      <w:lvlText w:val=""/>
+      <w:lvlJc w:val="left"/>
+    </w:lvl>
+    <w:lvl w:ilvl="4" w:tplc="FE1C0282">
+      <w:numFmt w:val="decimal"/>
+      <w:lvlText w:val=""/>
+      <w:lvlJc w:val="left"/>
+    </w:lvl>
+    <w:lvl w:ilvl="5" w:tplc="88325846">
+      <w:numFmt w:val="decimal"/>
+      <w:lvlText w:val=""/>
+      <w:lvlJc w:val="left"/>
+    </w:lvl>
+    <w:lvl w:ilvl="6" w:tplc="E2021E40">
+      <w:numFmt w:val="decimal"/>
+      <w:lvlText w:val=""/>
+      <w:lvlJc w:val="left"/>
+    </w:lvl>
+    <w:lvl w:ilvl="7" w:tplc="FD1260D0">
+      <w:numFmt w:val="decimal"/>
+      <w:lvlText w:val=""/>
+      <w:lvlJc w:val="left"/>
+    </w:lvl>
+    <w:lvl w:ilvl="8" w:tplc="99E8D564">
+      <w:numFmt w:val="decimal"/>
+      <w:lvlText w:val=""/>
+      <w:lvlJc w:val="left"/>
+    </w:lvl>
+  </w:abstractNum>
+  <w:num w:numId="1" w16cid:durableId="551118482">
+    <w:abstractNumId w:val="0"/>
     <w:lvlOverride w:ilvl="0">
       <w:startOverride w:val="1"/>
     </w:lvlOverride>
@@ -7807,7 +7807,7 @@
     <w:autoRedefine/>
     <w:uiPriority w:val="39"/>
     <w:unhideWhenUsed/>
-    <w:rsid w:val="00C11C00"/>
+    <w:rsid w:val="00833DC6"/>
     <w:pPr>
       <w:spacing w:after="100"/>
     </w:pPr>

</xml_diff>

<commit_message>
Reflejar el avance de los Sprints 1 y 2 del sistema y dar una semana para confirmar comunicaciones
- ALC-05: los paquetes de datos (1.2.1 y 1.2.2) pasan a demostrables, con la
  carga probada sobre el registro real y la validación nocturna.
- Tablero de comunicaciones: una comunicación cuya fecha pasó queda «por
  confirmar» durante una semana antes de contarse como vencida.

Co-Authored-By: Claude Opus 5.5 <noreply@anthropic.com>
</commit_message>
<xml_diff>
--- a/public/documentos/ALC-01-plan-de-gestion-del-alcance-y-de-los-requisitos.docx
+++ b/public/documentos/ALC-01-plan-de-gestion-del-alcance-y-de-los-requisitos.docx
@@ -52,7 +52,7 @@
                 <w:noProof/>
               </w:rPr>
               <w:drawing>
-                <wp:inline distT="0" distB="0" distL="0" distR="0" wp14:anchorId="4507D6A1" wp14:editId="58C1A90A">
+                <wp:inline distT="0" distB="0" distL="0" distR="0" wp14:anchorId="2896690E" wp14:editId="2D48FBC1">
                   <wp:extent cx="990600" cy="990600"/>
                   <wp:effectExtent l="0" t="0" r="0" b="0"/>
                   <wp:docPr id="1" name="Imagen 1"/>
@@ -171,10 +171,10 @@
                 <w:noProof/>
               </w:rPr>
               <w:drawing>
-                <wp:inline distT="0" distB="0" distL="0" distR="0" wp14:anchorId="187EDA93" wp14:editId="5593E921">
+                <wp:inline distT="0" distB="0" distL="0" distR="0" wp14:anchorId="63EEE165" wp14:editId="5E49C811">
                   <wp:extent cx="800100" cy="800100"/>
                   <wp:effectExtent l="0" t="0" r="0" b="0"/>
-                  <wp:docPr id="2012690453" name="Imagen 2012690453"/>
+                  <wp:docPr id="523337543" name="Imagen 523337543"/>
                   <wp:cNvGraphicFramePr>
                     <a:graphicFrameLocks xmlns:a="http://schemas.openxmlformats.org/drawingml/2006/main" noChangeAspect="1"/>
                   </wp:cNvGraphicFramePr>
@@ -2585,7 +2585,7 @@
     <w:sdt>
       <w:sdtPr>
         <w:alias w:val="Contenido"/>
-        <w:id w:val="901722024"/>
+        <w:id w:val="-386106791"/>
       </w:sdtPr>
       <w:sdtEndPr/>
       <w:sdtContent>
@@ -2611,7 +2611,7 @@
           <w:r>
             <w:fldChar w:fldCharType="separate"/>
           </w:r>
-          <w:hyperlink w:anchor="_Toc242543450" w:history="1">
+          <w:hyperlink w:anchor="_Toc242545478" w:history="1">
             <w:r>
               <w:rPr>
                 <w:rStyle w:val="Hipervnculo"/>
@@ -2635,7 +2635,7 @@
               <w:rPr>
                 <w:noProof/>
               </w:rPr>
-              <w:instrText xml:space="preserve"> PAGEREF _Toc242543450 \h </w:instrText>
+              <w:instrText xml:space="preserve"> PAGEREF _Toc242545478 \h </w:instrText>
             </w:r>
             <w:r>
               <w:rPr>
@@ -2675,7 +2675,7 @@
               <w14:ligatures w14:val="standardContextual"/>
             </w:rPr>
           </w:pPr>
-          <w:hyperlink w:anchor="_Toc242543451" w:history="1">
+          <w:hyperlink w:anchor="_Toc242545479" w:history="1">
             <w:r>
               <w:rPr>
                 <w:rStyle w:val="Hipervnculo"/>
@@ -2699,7 +2699,7 @@
               <w:rPr>
                 <w:noProof/>
               </w:rPr>
-              <w:instrText xml:space="preserve"> PAGEREF _Toc242543451 \h </w:instrText>
+              <w:instrText xml:space="preserve"> PAGEREF _Toc242545479 \h </w:instrText>
             </w:r>
             <w:r>
               <w:rPr>
@@ -2739,7 +2739,7 @@
               <w14:ligatures w14:val="standardContextual"/>
             </w:rPr>
           </w:pPr>
-          <w:hyperlink w:anchor="_Toc242543452" w:history="1">
+          <w:hyperlink w:anchor="_Toc242545480" w:history="1">
             <w:r>
               <w:rPr>
                 <w:rStyle w:val="Hipervnculo"/>
@@ -2763,7 +2763,7 @@
               <w:rPr>
                 <w:noProof/>
               </w:rPr>
-              <w:instrText xml:space="preserve"> PAGEREF _Toc242543452 \h </w:instrText>
+              <w:instrText xml:space="preserve"> PAGEREF _Toc242545480 \h </w:instrText>
             </w:r>
             <w:r>
               <w:rPr>
@@ -2803,7 +2803,7 @@
               <w14:ligatures w14:val="standardContextual"/>
             </w:rPr>
           </w:pPr>
-          <w:hyperlink w:anchor="_Toc242543453" w:history="1">
+          <w:hyperlink w:anchor="_Toc242545481" w:history="1">
             <w:r>
               <w:rPr>
                 <w:rStyle w:val="Hipervnculo"/>
@@ -2827,7 +2827,7 @@
               <w:rPr>
                 <w:noProof/>
               </w:rPr>
-              <w:instrText xml:space="preserve"> PAGEREF _Toc242543453 \h </w:instrText>
+              <w:instrText xml:space="preserve"> PAGEREF _Toc242545481 \h </w:instrText>
             </w:r>
             <w:r>
               <w:rPr>
@@ -2867,7 +2867,7 @@
               <w14:ligatures w14:val="standardContextual"/>
             </w:rPr>
           </w:pPr>
-          <w:hyperlink w:anchor="_Toc242543454" w:history="1">
+          <w:hyperlink w:anchor="_Toc242545482" w:history="1">
             <w:r>
               <w:rPr>
                 <w:rStyle w:val="Hipervnculo"/>
@@ -2891,7 +2891,7 @@
               <w:rPr>
                 <w:noProof/>
               </w:rPr>
-              <w:instrText xml:space="preserve"> PAGEREF _Toc242543454 \h </w:instrText>
+              <w:instrText xml:space="preserve"> PAGEREF _Toc242545482 \h </w:instrText>
             </w:r>
             <w:r>
               <w:rPr>
@@ -2931,7 +2931,7 @@
               <w14:ligatures w14:val="standardContextual"/>
             </w:rPr>
           </w:pPr>
-          <w:hyperlink w:anchor="_Toc242543455" w:history="1">
+          <w:hyperlink w:anchor="_Toc242545483" w:history="1">
             <w:r>
               <w:rPr>
                 <w:rStyle w:val="Hipervnculo"/>
@@ -2955,7 +2955,7 @@
               <w:rPr>
                 <w:noProof/>
               </w:rPr>
-              <w:instrText xml:space="preserve"> PAGEREF _Toc242543455 \h </w:instrText>
+              <w:instrText xml:space="preserve"> PAGEREF _Toc242545483 \h </w:instrText>
             </w:r>
             <w:r>
               <w:rPr>
@@ -3005,7 +3005,7 @@
       <w:pPr>
         <w:pStyle w:val="Ttulo1"/>
       </w:pPr>
-      <w:bookmarkStart w:id="0" w:name="_Toc242543450"/>
+      <w:bookmarkStart w:id="0" w:name="_Toc242545478"/>
       <w:r>
         <w:lastRenderedPageBreak/>
         <w:t>1. Propósito y enfoque</w:t>
@@ -3054,7 +3054,7 @@
       <w:pPr>
         <w:pStyle w:val="Ttulo1"/>
       </w:pPr>
-      <w:bookmarkStart w:id="1" w:name="_Toc242543451"/>
+      <w:bookmarkStart w:id="1" w:name="_Toc242545479"/>
       <w:r>
         <w:t>2. Procesos del alcance en este proyecto</w:t>
       </w:r>
@@ -3979,7 +3979,7 @@
       <w:pPr>
         <w:pStyle w:val="Ttulo1"/>
       </w:pPr>
-      <w:bookmarkStart w:id="2" w:name="_Toc242543452"/>
+      <w:bookmarkStart w:id="2" w:name="_Toc242545480"/>
       <w:r>
         <w:t>3. Gestión de los requisitos</w:t>
       </w:r>
@@ -4518,7 +4518,7 @@
       <w:pPr>
         <w:pStyle w:val="Ttulo1"/>
       </w:pPr>
-      <w:bookmarkStart w:id="3" w:name="_Toc242543453"/>
+      <w:bookmarkStart w:id="3" w:name="_Toc242545481"/>
       <w:r>
         <w:t>4. Métricas del alcance</w:t>
       </w:r>
@@ -5586,7 +5586,7 @@
       <w:pPr>
         <w:pStyle w:val="Ttulo1"/>
       </w:pPr>
-      <w:bookmarkStart w:id="4" w:name="_Toc242543454"/>
+      <w:bookmarkStart w:id="4" w:name="_Toc242545482"/>
       <w:r>
         <w:t>5. Línea base del alcance</w:t>
       </w:r>
@@ -6107,7 +6107,7 @@
       <w:pPr>
         <w:pStyle w:val="Ttulo1"/>
       </w:pPr>
-      <w:bookmarkStart w:id="5" w:name="_Toc242543455"/>
+      <w:bookmarkStart w:id="5" w:name="_Toc242545483"/>
       <w:r>
         <w:t>6. Roles</w:t>
       </w:r>
@@ -7021,10 +7021,118 @@
 <file path=word/numbering.xml><?xml version="1.0" encoding="utf-8"?>
 <w:numbering xmlns:wpc="http://schemas.microsoft.com/office/word/2010/wordprocessingCanvas" xmlns:cx="http://schemas.microsoft.com/office/drawing/2014/chartex" xmlns:cx1="http://schemas.microsoft.com/office/drawing/2015/9/8/chartex" xmlns:cx2="http://schemas.microsoft.com/office/drawing/2015/10/21/chartex" xmlns:cx3="http://schemas.microsoft.com/office/drawing/2016/5/9/chartex" xmlns:cx4="http://schemas.microsoft.com/office/drawing/2016/5/10/chartex" xmlns:cx5="http://schemas.microsoft.com/office/drawing/2016/5/11/chartex" xmlns:cx6="http://schemas.microsoft.com/office/drawing/2016/5/12/chartex" xmlns:cx7="http://schemas.microsoft.com/office/drawing/2016/5/13/chartex" xmlns:cx8="http://schemas.microsoft.com/office/drawing/2016/5/14/chartex" xmlns:mc="http://schemas.openxmlformats.org/markup-compatibility/2006" xmlns:aink="http://schemas.microsoft.com/office/drawing/2016/ink" xmlns:am3d="http://schemas.microsoft.com/office/drawing/2017/model3d" xmlns:o="urn:schemas-microsoft-com:office:office" xmlns:oel="http://schemas.microsoft.com/office/2019/extlst" xmlns:r="http://schemas.openxmlformats.org/officeDocument/2006/relationships" xmlns:m="http://schemas.openxmlformats.org/officeDocument/2006/math" xmlns:v="urn:schemas-microsoft-com:vml" xmlns:wp14="http://schemas.microsoft.com/office/word/2010/wordprocessingDrawing" xmlns:wp="http://schemas.openxmlformats.org/drawingml/2006/wordprocessingDrawing" xmlns:w10="urn:schemas-microsoft-com:office:word" xmlns:w="http://schemas.openxmlformats.org/wordprocessingml/2006/main" xmlns:w14="http://schemas.microsoft.com/office/word/2010/wordml" xmlns:w15="http://schemas.microsoft.com/office/word/2012/wordml" xmlns:w16cex="http://schemas.microsoft.com/office/word/2018/wordml/cex" xmlns:w16cid="http://schemas.microsoft.com/office/word/2016/wordml/cid" xmlns:w16="http://schemas.microsoft.com/office/word/2018/wordml" xmlns:w16du="http://schemas.microsoft.com/office/word/2023/wordml/word16du" xmlns:w16sdtdh="http://schemas.microsoft.com/office/word/2020/wordml/sdtdatahash" xmlns:w16sdtfl="http://schemas.microsoft.com/office/word/2024/wordml/sdtformatlock" xmlns:w16se="http://schemas.microsoft.com/office/word/2015/wordml/symex" xmlns:wpg="http://schemas.microsoft.com/office/word/2010/wordprocessingGroup" xmlns:wpi="http://schemas.microsoft.com/office/word/2010/wordprocessingInk" xmlns:wne="http://schemas.microsoft.com/office/word/2006/wordml" xmlns:wps="http://schemas.microsoft.com/office/word/2010/wordprocessingShape" mc:Ignorable="w14 w15 w16se w16cid w16 w16cex w16sdtdh w16sdtfl w16du wp14">
   <w:abstractNum w:abstractNumId="0" w15:restartNumberingAfterBreak="0">
-    <w:nsid w:val="0DAD59B5"/>
+    <w:nsid w:val="2EF82C40"/>
     <w:multiLevelType w:val="hybridMultilevel"/>
-    <w:tmpl w:val="9826617E"/>
-    <w:lvl w:ilvl="0" w:tplc="AB9C238E">
+    <w:tmpl w:val="7C20759A"/>
+    <w:lvl w:ilvl="0" w:tplc="008EB832">
+      <w:start w:val="1"/>
+      <w:numFmt w:val="bullet"/>
+      <w:lvlText w:val="•"/>
+      <w:lvlJc w:val="left"/>
+      <w:pPr>
+        <w:ind w:left="560" w:hanging="280"/>
+      </w:pPr>
+    </w:lvl>
+    <w:lvl w:ilvl="1" w:tplc="05749BB2">
+      <w:numFmt w:val="decimal"/>
+      <w:lvlText w:val=""/>
+      <w:lvlJc w:val="left"/>
+    </w:lvl>
+    <w:lvl w:ilvl="2" w:tplc="932A5724">
+      <w:numFmt w:val="decimal"/>
+      <w:lvlText w:val=""/>
+      <w:lvlJc w:val="left"/>
+    </w:lvl>
+    <w:lvl w:ilvl="3" w:tplc="512EE8FE">
+      <w:numFmt w:val="decimal"/>
+      <w:lvlText w:val=""/>
+      <w:lvlJc w:val="left"/>
+    </w:lvl>
+    <w:lvl w:ilvl="4" w:tplc="F8C40880">
+      <w:numFmt w:val="decimal"/>
+      <w:lvlText w:val=""/>
+      <w:lvlJc w:val="left"/>
+    </w:lvl>
+    <w:lvl w:ilvl="5" w:tplc="82DE0910">
+      <w:numFmt w:val="decimal"/>
+      <w:lvlText w:val=""/>
+      <w:lvlJc w:val="left"/>
+    </w:lvl>
+    <w:lvl w:ilvl="6" w:tplc="16D2EC58">
+      <w:numFmt w:val="decimal"/>
+      <w:lvlText w:val=""/>
+      <w:lvlJc w:val="left"/>
+    </w:lvl>
+    <w:lvl w:ilvl="7" w:tplc="864A6CF4">
+      <w:numFmt w:val="decimal"/>
+      <w:lvlText w:val=""/>
+      <w:lvlJc w:val="left"/>
+    </w:lvl>
+    <w:lvl w:ilvl="8" w:tplc="6136AAC8">
+      <w:numFmt w:val="decimal"/>
+      <w:lvlText w:val=""/>
+      <w:lvlJc w:val="left"/>
+    </w:lvl>
+  </w:abstractNum>
+  <w:abstractNum w:abstractNumId="1" w15:restartNumberingAfterBreak="0">
+    <w:nsid w:val="3AB31CE2"/>
+    <w:multiLevelType w:val="hybridMultilevel"/>
+    <w:tmpl w:val="9928312A"/>
+    <w:lvl w:ilvl="0" w:tplc="6FF8EA2E">
+      <w:start w:val="1"/>
+      <w:numFmt w:val="decimal"/>
+      <w:lvlText w:val="%1."/>
+      <w:lvlJc w:val="left"/>
+      <w:pPr>
+        <w:ind w:left="560" w:hanging="340"/>
+      </w:pPr>
+    </w:lvl>
+    <w:lvl w:ilvl="1" w:tplc="91585AE6">
+      <w:numFmt w:val="decimal"/>
+      <w:lvlText w:val=""/>
+      <w:lvlJc w:val="left"/>
+    </w:lvl>
+    <w:lvl w:ilvl="2" w:tplc="B9E86B58">
+      <w:numFmt w:val="decimal"/>
+      <w:lvlText w:val=""/>
+      <w:lvlJc w:val="left"/>
+    </w:lvl>
+    <w:lvl w:ilvl="3" w:tplc="A0708202">
+      <w:numFmt w:val="decimal"/>
+      <w:lvlText w:val=""/>
+      <w:lvlJc w:val="left"/>
+    </w:lvl>
+    <w:lvl w:ilvl="4" w:tplc="1C00A1E0">
+      <w:numFmt w:val="decimal"/>
+      <w:lvlText w:val=""/>
+      <w:lvlJc w:val="left"/>
+    </w:lvl>
+    <w:lvl w:ilvl="5" w:tplc="A2B22B82">
+      <w:numFmt w:val="decimal"/>
+      <w:lvlText w:val=""/>
+      <w:lvlJc w:val="left"/>
+    </w:lvl>
+    <w:lvl w:ilvl="6" w:tplc="76284E56">
+      <w:numFmt w:val="decimal"/>
+      <w:lvlText w:val=""/>
+      <w:lvlJc w:val="left"/>
+    </w:lvl>
+    <w:lvl w:ilvl="7" w:tplc="9F52A10A">
+      <w:numFmt w:val="decimal"/>
+      <w:lvlText w:val=""/>
+      <w:lvlJc w:val="left"/>
+    </w:lvl>
+    <w:lvl w:ilvl="8" w:tplc="A84E6164">
+      <w:numFmt w:val="decimal"/>
+      <w:lvlText w:val=""/>
+      <w:lvlJc w:val="left"/>
+    </w:lvl>
+  </w:abstractNum>
+  <w:abstractNum w:abstractNumId="2" w15:restartNumberingAfterBreak="0">
+    <w:nsid w:val="51EF12A2"/>
+    <w:multiLevelType w:val="hybridMultilevel"/>
+    <w:tmpl w:val="0928C16C"/>
+    <w:lvl w:ilvl="0" w:tplc="F634D89C">
       <w:start w:val="1"/>
       <w:numFmt w:val="bullet"/>
       <w:lvlText w:val="●"/>
@@ -7033,7 +7141,7 @@
         <w:ind w:left="720" w:hanging="360"/>
       </w:pPr>
     </w:lvl>
-    <w:lvl w:ilvl="1" w:tplc="4944228E">
+    <w:lvl w:ilvl="1" w:tplc="5CACA550">
       <w:start w:val="1"/>
       <w:numFmt w:val="bullet"/>
       <w:lvlText w:val="○"/>
@@ -7042,7 +7150,7 @@
         <w:ind w:left="1440" w:hanging="360"/>
       </w:pPr>
     </w:lvl>
-    <w:lvl w:ilvl="2" w:tplc="23385C12">
+    <w:lvl w:ilvl="2" w:tplc="8B8E2CAA">
       <w:start w:val="1"/>
       <w:numFmt w:val="bullet"/>
       <w:lvlText w:val="■"/>
@@ -7051,7 +7159,7 @@
         <w:ind w:left="2160" w:hanging="360"/>
       </w:pPr>
     </w:lvl>
-    <w:lvl w:ilvl="3" w:tplc="A7306AEE">
+    <w:lvl w:ilvl="3" w:tplc="EC087802">
       <w:start w:val="1"/>
       <w:numFmt w:val="bullet"/>
       <w:lvlText w:val="●"/>
@@ -7060,7 +7168,7 @@
         <w:ind w:left="2880" w:hanging="360"/>
       </w:pPr>
     </w:lvl>
-    <w:lvl w:ilvl="4" w:tplc="B978C656">
+    <w:lvl w:ilvl="4" w:tplc="7E2E4C82">
       <w:start w:val="1"/>
       <w:numFmt w:val="bullet"/>
       <w:lvlText w:val="○"/>
@@ -7069,7 +7177,7 @@
         <w:ind w:left="3600" w:hanging="360"/>
       </w:pPr>
     </w:lvl>
-    <w:lvl w:ilvl="5" w:tplc="83306D2E">
+    <w:lvl w:ilvl="5" w:tplc="A9FA4FEC">
       <w:start w:val="1"/>
       <w:numFmt w:val="bullet"/>
       <w:lvlText w:val="■"/>
@@ -7078,7 +7186,7 @@
         <w:ind w:left="4320" w:hanging="360"/>
       </w:pPr>
     </w:lvl>
-    <w:lvl w:ilvl="6" w:tplc="DBCA6412">
+    <w:lvl w:ilvl="6" w:tplc="8B1423E6">
       <w:start w:val="1"/>
       <w:numFmt w:val="bullet"/>
       <w:lvlText w:val="●"/>
@@ -7087,7 +7195,7 @@
         <w:ind w:left="5040" w:hanging="360"/>
       </w:pPr>
     </w:lvl>
-    <w:lvl w:ilvl="7" w:tplc="A0B6F26A">
+    <w:lvl w:ilvl="7" w:tplc="8DAECF78">
       <w:start w:val="1"/>
       <w:numFmt w:val="bullet"/>
       <w:lvlText w:val="●"/>
@@ -7096,7 +7204,7 @@
         <w:ind w:left="5760" w:hanging="360"/>
       </w:pPr>
     </w:lvl>
-    <w:lvl w:ilvl="8" w:tplc="812CE36C">
+    <w:lvl w:ilvl="8" w:tplc="D210607C">
       <w:start w:val="1"/>
       <w:numFmt w:val="bullet"/>
       <w:lvlText w:val="●"/>
@@ -7106,116 +7214,8 @@
       </w:pPr>
     </w:lvl>
   </w:abstractNum>
-  <w:abstractNum w:abstractNumId="1" w15:restartNumberingAfterBreak="0">
-    <w:nsid w:val="27AA5853"/>
-    <w:multiLevelType w:val="hybridMultilevel"/>
-    <w:tmpl w:val="7C2E8FAA"/>
-    <w:lvl w:ilvl="0" w:tplc="02BC3902">
-      <w:start w:val="1"/>
-      <w:numFmt w:val="bullet"/>
-      <w:lvlText w:val="•"/>
-      <w:lvlJc w:val="left"/>
-      <w:pPr>
-        <w:ind w:left="560" w:hanging="280"/>
-      </w:pPr>
-    </w:lvl>
-    <w:lvl w:ilvl="1" w:tplc="6BF89332">
-      <w:numFmt w:val="decimal"/>
-      <w:lvlText w:val=""/>
-      <w:lvlJc w:val="left"/>
-    </w:lvl>
-    <w:lvl w:ilvl="2" w:tplc="82DC9D38">
-      <w:numFmt w:val="decimal"/>
-      <w:lvlText w:val=""/>
-      <w:lvlJc w:val="left"/>
-    </w:lvl>
-    <w:lvl w:ilvl="3" w:tplc="E4227742">
-      <w:numFmt w:val="decimal"/>
-      <w:lvlText w:val=""/>
-      <w:lvlJc w:val="left"/>
-    </w:lvl>
-    <w:lvl w:ilvl="4" w:tplc="BBC89A4E">
-      <w:numFmt w:val="decimal"/>
-      <w:lvlText w:val=""/>
-      <w:lvlJc w:val="left"/>
-    </w:lvl>
-    <w:lvl w:ilvl="5" w:tplc="420C2640">
-      <w:numFmt w:val="decimal"/>
-      <w:lvlText w:val=""/>
-      <w:lvlJc w:val="left"/>
-    </w:lvl>
-    <w:lvl w:ilvl="6" w:tplc="E1C6164C">
-      <w:numFmt w:val="decimal"/>
-      <w:lvlText w:val=""/>
-      <w:lvlJc w:val="left"/>
-    </w:lvl>
-    <w:lvl w:ilvl="7" w:tplc="D5B2CDD0">
-      <w:numFmt w:val="decimal"/>
-      <w:lvlText w:val=""/>
-      <w:lvlJc w:val="left"/>
-    </w:lvl>
-    <w:lvl w:ilvl="8" w:tplc="245AFFD4">
-      <w:numFmt w:val="decimal"/>
-      <w:lvlText w:val=""/>
-      <w:lvlJc w:val="left"/>
-    </w:lvl>
-  </w:abstractNum>
-  <w:abstractNum w:abstractNumId="2" w15:restartNumberingAfterBreak="0">
-    <w:nsid w:val="68EF7557"/>
-    <w:multiLevelType w:val="hybridMultilevel"/>
-    <w:tmpl w:val="B5C85096"/>
-    <w:lvl w:ilvl="0" w:tplc="1C58E39A">
-      <w:start w:val="1"/>
-      <w:numFmt w:val="decimal"/>
-      <w:lvlText w:val="%1."/>
-      <w:lvlJc w:val="left"/>
-      <w:pPr>
-        <w:ind w:left="560" w:hanging="340"/>
-      </w:pPr>
-    </w:lvl>
-    <w:lvl w:ilvl="1" w:tplc="4C421584">
-      <w:numFmt w:val="decimal"/>
-      <w:lvlText w:val=""/>
-      <w:lvlJc w:val="left"/>
-    </w:lvl>
-    <w:lvl w:ilvl="2" w:tplc="DEC00EE0">
-      <w:numFmt w:val="decimal"/>
-      <w:lvlText w:val=""/>
-      <w:lvlJc w:val="left"/>
-    </w:lvl>
-    <w:lvl w:ilvl="3" w:tplc="16AAEC26">
-      <w:numFmt w:val="decimal"/>
-      <w:lvlText w:val=""/>
-      <w:lvlJc w:val="left"/>
-    </w:lvl>
-    <w:lvl w:ilvl="4" w:tplc="FE1C0282">
-      <w:numFmt w:val="decimal"/>
-      <w:lvlText w:val=""/>
-      <w:lvlJc w:val="left"/>
-    </w:lvl>
-    <w:lvl w:ilvl="5" w:tplc="88325846">
-      <w:numFmt w:val="decimal"/>
-      <w:lvlText w:val=""/>
-      <w:lvlJc w:val="left"/>
-    </w:lvl>
-    <w:lvl w:ilvl="6" w:tplc="E2021E40">
-      <w:numFmt w:val="decimal"/>
-      <w:lvlText w:val=""/>
-      <w:lvlJc w:val="left"/>
-    </w:lvl>
-    <w:lvl w:ilvl="7" w:tplc="FD1260D0">
-      <w:numFmt w:val="decimal"/>
-      <w:lvlText w:val=""/>
-      <w:lvlJc w:val="left"/>
-    </w:lvl>
-    <w:lvl w:ilvl="8" w:tplc="99E8D564">
-      <w:numFmt w:val="decimal"/>
-      <w:lvlText w:val=""/>
-      <w:lvlJc w:val="left"/>
-    </w:lvl>
-  </w:abstractNum>
-  <w:num w:numId="1" w16cid:durableId="551118482">
-    <w:abstractNumId w:val="0"/>
+  <w:num w:numId="1" w16cid:durableId="1460882828">
+    <w:abstractNumId w:val="2"/>
     <w:lvlOverride w:ilvl="0">
       <w:startOverride w:val="1"/>
     </w:lvlOverride>
@@ -7807,7 +7807,7 @@
     <w:autoRedefine/>
     <w:uiPriority w:val="39"/>
     <w:unhideWhenUsed/>
-    <w:rsid w:val="00833DC6"/>
+    <w:rsid w:val="00A04E69"/>
     <w:pPr>
       <w:spacing w:after="100"/>
     </w:pPr>

</xml_diff>

<commit_message>
Dejar el informe de avance por EDT como estaba publicado
Se descarta la actualización con los Sprints 1 y 2 del sistema. Se mantiene el
plazo de una semana «por confirmar» del tablero de comunicaciones.

Co-Authored-By: Claude Opus 5.5 <noreply@anthropic.com>
</commit_message>
<xml_diff>
--- a/public/documentos/ALC-01-plan-de-gestion-del-alcance-y-de-los-requisitos.docx
+++ b/public/documentos/ALC-01-plan-de-gestion-del-alcance-y-de-los-requisitos.docx
@@ -52,7 +52,7 @@
                 <w:noProof/>
               </w:rPr>
               <w:drawing>
-                <wp:inline distT="0" distB="0" distL="0" distR="0" wp14:anchorId="2896690E" wp14:editId="2D48FBC1">
+                <wp:inline distT="0" distB="0" distL="0" distR="0" wp14:anchorId="4B4058F0" wp14:editId="7EA0CB92">
                   <wp:extent cx="990600" cy="990600"/>
                   <wp:effectExtent l="0" t="0" r="0" b="0"/>
                   <wp:docPr id="1" name="Imagen 1"/>
@@ -171,10 +171,10 @@
                 <w:noProof/>
               </w:rPr>
               <w:drawing>
-                <wp:inline distT="0" distB="0" distL="0" distR="0" wp14:anchorId="63EEE165" wp14:editId="5E49C811">
+                <wp:inline distT="0" distB="0" distL="0" distR="0" wp14:anchorId="79AE9ED1" wp14:editId="3B0F9EA7">
                   <wp:extent cx="800100" cy="800100"/>
                   <wp:effectExtent l="0" t="0" r="0" b="0"/>
-                  <wp:docPr id="523337543" name="Imagen 523337543"/>
+                  <wp:docPr id="624520274" name="Imagen 624520274"/>
                   <wp:cNvGraphicFramePr>
                     <a:graphicFrameLocks xmlns:a="http://schemas.openxmlformats.org/drawingml/2006/main" noChangeAspect="1"/>
                   </wp:cNvGraphicFramePr>
@@ -2585,7 +2585,7 @@
     <w:sdt>
       <w:sdtPr>
         <w:alias w:val="Contenido"/>
-        <w:id w:val="-386106791"/>
+        <w:id w:val="236676651"/>
       </w:sdtPr>
       <w:sdtEndPr/>
       <w:sdtContent>
@@ -2611,7 +2611,7 @@
           <w:r>
             <w:fldChar w:fldCharType="separate"/>
           </w:r>
-          <w:hyperlink w:anchor="_Toc242545478" w:history="1">
+          <w:hyperlink w:anchor="_Toc242549692" w:history="1">
             <w:r>
               <w:rPr>
                 <w:rStyle w:val="Hipervnculo"/>
@@ -2635,7 +2635,7 @@
               <w:rPr>
                 <w:noProof/>
               </w:rPr>
-              <w:instrText xml:space="preserve"> PAGEREF _Toc242545478 \h </w:instrText>
+              <w:instrText xml:space="preserve"> PAGEREF _Toc242549692 \h </w:instrText>
             </w:r>
             <w:r>
               <w:rPr>
@@ -2675,7 +2675,7 @@
               <w14:ligatures w14:val="standardContextual"/>
             </w:rPr>
           </w:pPr>
-          <w:hyperlink w:anchor="_Toc242545479" w:history="1">
+          <w:hyperlink w:anchor="_Toc242549693" w:history="1">
             <w:r>
               <w:rPr>
                 <w:rStyle w:val="Hipervnculo"/>
@@ -2699,7 +2699,7 @@
               <w:rPr>
                 <w:noProof/>
               </w:rPr>
-              <w:instrText xml:space="preserve"> PAGEREF _Toc242545479 \h </w:instrText>
+              <w:instrText xml:space="preserve"> PAGEREF _Toc242549693 \h </w:instrText>
             </w:r>
             <w:r>
               <w:rPr>
@@ -2739,7 +2739,7 @@
               <w14:ligatures w14:val="standardContextual"/>
             </w:rPr>
           </w:pPr>
-          <w:hyperlink w:anchor="_Toc242545480" w:history="1">
+          <w:hyperlink w:anchor="_Toc242549694" w:history="1">
             <w:r>
               <w:rPr>
                 <w:rStyle w:val="Hipervnculo"/>
@@ -2763,7 +2763,7 @@
               <w:rPr>
                 <w:noProof/>
               </w:rPr>
-              <w:instrText xml:space="preserve"> PAGEREF _Toc242545480 \h </w:instrText>
+              <w:instrText xml:space="preserve"> PAGEREF _Toc242549694 \h </w:instrText>
             </w:r>
             <w:r>
               <w:rPr>
@@ -2803,7 +2803,7 @@
               <w14:ligatures w14:val="standardContextual"/>
             </w:rPr>
           </w:pPr>
-          <w:hyperlink w:anchor="_Toc242545481" w:history="1">
+          <w:hyperlink w:anchor="_Toc242549695" w:history="1">
             <w:r>
               <w:rPr>
                 <w:rStyle w:val="Hipervnculo"/>
@@ -2827,7 +2827,7 @@
               <w:rPr>
                 <w:noProof/>
               </w:rPr>
-              <w:instrText xml:space="preserve"> PAGEREF _Toc242545481 \h </w:instrText>
+              <w:instrText xml:space="preserve"> PAGEREF _Toc242549695 \h </w:instrText>
             </w:r>
             <w:r>
               <w:rPr>
@@ -2867,7 +2867,7 @@
               <w14:ligatures w14:val="standardContextual"/>
             </w:rPr>
           </w:pPr>
-          <w:hyperlink w:anchor="_Toc242545482" w:history="1">
+          <w:hyperlink w:anchor="_Toc242549696" w:history="1">
             <w:r>
               <w:rPr>
                 <w:rStyle w:val="Hipervnculo"/>
@@ -2891,7 +2891,7 @@
               <w:rPr>
                 <w:noProof/>
               </w:rPr>
-              <w:instrText xml:space="preserve"> PAGEREF _Toc242545482 \h </w:instrText>
+              <w:instrText xml:space="preserve"> PAGEREF _Toc242549696 \h </w:instrText>
             </w:r>
             <w:r>
               <w:rPr>
@@ -2931,7 +2931,7 @@
               <w14:ligatures w14:val="standardContextual"/>
             </w:rPr>
           </w:pPr>
-          <w:hyperlink w:anchor="_Toc242545483" w:history="1">
+          <w:hyperlink w:anchor="_Toc242549697" w:history="1">
             <w:r>
               <w:rPr>
                 <w:rStyle w:val="Hipervnculo"/>
@@ -2955,7 +2955,7 @@
               <w:rPr>
                 <w:noProof/>
               </w:rPr>
-              <w:instrText xml:space="preserve"> PAGEREF _Toc242545483 \h </w:instrText>
+              <w:instrText xml:space="preserve"> PAGEREF _Toc242549697 \h </w:instrText>
             </w:r>
             <w:r>
               <w:rPr>
@@ -3005,7 +3005,7 @@
       <w:pPr>
         <w:pStyle w:val="Ttulo1"/>
       </w:pPr>
-      <w:bookmarkStart w:id="0" w:name="_Toc242545478"/>
+      <w:bookmarkStart w:id="0" w:name="_Toc242549692"/>
       <w:r>
         <w:lastRenderedPageBreak/>
         <w:t>1. Propósito y enfoque</w:t>
@@ -3054,7 +3054,7 @@
       <w:pPr>
         <w:pStyle w:val="Ttulo1"/>
       </w:pPr>
-      <w:bookmarkStart w:id="1" w:name="_Toc242545479"/>
+      <w:bookmarkStart w:id="1" w:name="_Toc242549693"/>
       <w:r>
         <w:t>2. Procesos del alcance en este proyecto</w:t>
       </w:r>
@@ -3979,7 +3979,7 @@
       <w:pPr>
         <w:pStyle w:val="Ttulo1"/>
       </w:pPr>
-      <w:bookmarkStart w:id="2" w:name="_Toc242545480"/>
+      <w:bookmarkStart w:id="2" w:name="_Toc242549694"/>
       <w:r>
         <w:t>3. Gestión de los requisitos</w:t>
       </w:r>
@@ -4518,7 +4518,7 @@
       <w:pPr>
         <w:pStyle w:val="Ttulo1"/>
       </w:pPr>
-      <w:bookmarkStart w:id="3" w:name="_Toc242545481"/>
+      <w:bookmarkStart w:id="3" w:name="_Toc242549695"/>
       <w:r>
         <w:t>4. Métricas del alcance</w:t>
       </w:r>
@@ -5586,7 +5586,7 @@
       <w:pPr>
         <w:pStyle w:val="Ttulo1"/>
       </w:pPr>
-      <w:bookmarkStart w:id="4" w:name="_Toc242545482"/>
+      <w:bookmarkStart w:id="4" w:name="_Toc242549696"/>
       <w:r>
         <w:t>5. Línea base del alcance</w:t>
       </w:r>
@@ -6107,7 +6107,7 @@
       <w:pPr>
         <w:pStyle w:val="Ttulo1"/>
       </w:pPr>
-      <w:bookmarkStart w:id="5" w:name="_Toc242545483"/>
+      <w:bookmarkStart w:id="5" w:name="_Toc242549697"/>
       <w:r>
         <w:t>6. Roles</w:t>
       </w:r>
@@ -7021,64 +7021,10 @@
 <file path=word/numbering.xml><?xml version="1.0" encoding="utf-8"?>
 <w:numbering xmlns:wpc="http://schemas.microsoft.com/office/word/2010/wordprocessingCanvas" xmlns:cx="http://schemas.microsoft.com/office/drawing/2014/chartex" xmlns:cx1="http://schemas.microsoft.com/office/drawing/2015/9/8/chartex" xmlns:cx2="http://schemas.microsoft.com/office/drawing/2015/10/21/chartex" xmlns:cx3="http://schemas.microsoft.com/office/drawing/2016/5/9/chartex" xmlns:cx4="http://schemas.microsoft.com/office/drawing/2016/5/10/chartex" xmlns:cx5="http://schemas.microsoft.com/office/drawing/2016/5/11/chartex" xmlns:cx6="http://schemas.microsoft.com/office/drawing/2016/5/12/chartex" xmlns:cx7="http://schemas.microsoft.com/office/drawing/2016/5/13/chartex" xmlns:cx8="http://schemas.microsoft.com/office/drawing/2016/5/14/chartex" xmlns:mc="http://schemas.openxmlformats.org/markup-compatibility/2006" xmlns:aink="http://schemas.microsoft.com/office/drawing/2016/ink" xmlns:am3d="http://schemas.microsoft.com/office/drawing/2017/model3d" xmlns:o="urn:schemas-microsoft-com:office:office" xmlns:oel="http://schemas.microsoft.com/office/2019/extlst" xmlns:r="http://schemas.openxmlformats.org/officeDocument/2006/relationships" xmlns:m="http://schemas.openxmlformats.org/officeDocument/2006/math" xmlns:v="urn:schemas-microsoft-com:vml" xmlns:wp14="http://schemas.microsoft.com/office/word/2010/wordprocessingDrawing" xmlns:wp="http://schemas.openxmlformats.org/drawingml/2006/wordprocessingDrawing" xmlns:w10="urn:schemas-microsoft-com:office:word" xmlns:w="http://schemas.openxmlformats.org/wordprocessingml/2006/main" xmlns:w14="http://schemas.microsoft.com/office/word/2010/wordml" xmlns:w15="http://schemas.microsoft.com/office/word/2012/wordml" xmlns:w16cex="http://schemas.microsoft.com/office/word/2018/wordml/cex" xmlns:w16cid="http://schemas.microsoft.com/office/word/2016/wordml/cid" xmlns:w16="http://schemas.microsoft.com/office/word/2018/wordml" xmlns:w16du="http://schemas.microsoft.com/office/word/2023/wordml/word16du" xmlns:w16sdtdh="http://schemas.microsoft.com/office/word/2020/wordml/sdtdatahash" xmlns:w16sdtfl="http://schemas.microsoft.com/office/word/2024/wordml/sdtformatlock" xmlns:w16se="http://schemas.microsoft.com/office/word/2015/wordml/symex" xmlns:wpg="http://schemas.microsoft.com/office/word/2010/wordprocessingGroup" xmlns:wpi="http://schemas.microsoft.com/office/word/2010/wordprocessingInk" xmlns:wne="http://schemas.microsoft.com/office/word/2006/wordml" xmlns:wps="http://schemas.microsoft.com/office/word/2010/wordprocessingShape" mc:Ignorable="w14 w15 w16se w16cid w16 w16cex w16sdtdh w16sdtfl w16du wp14">
   <w:abstractNum w:abstractNumId="0" w15:restartNumberingAfterBreak="0">
-    <w:nsid w:val="2EF82C40"/>
+    <w:nsid w:val="2BD71B23"/>
     <w:multiLevelType w:val="hybridMultilevel"/>
-    <w:tmpl w:val="7C20759A"/>
-    <w:lvl w:ilvl="0" w:tplc="008EB832">
-      <w:start w:val="1"/>
-      <w:numFmt w:val="bullet"/>
-      <w:lvlText w:val="•"/>
-      <w:lvlJc w:val="left"/>
-      <w:pPr>
-        <w:ind w:left="560" w:hanging="280"/>
-      </w:pPr>
-    </w:lvl>
-    <w:lvl w:ilvl="1" w:tplc="05749BB2">
-      <w:numFmt w:val="decimal"/>
-      <w:lvlText w:val=""/>
-      <w:lvlJc w:val="left"/>
-    </w:lvl>
-    <w:lvl w:ilvl="2" w:tplc="932A5724">
-      <w:numFmt w:val="decimal"/>
-      <w:lvlText w:val=""/>
-      <w:lvlJc w:val="left"/>
-    </w:lvl>
-    <w:lvl w:ilvl="3" w:tplc="512EE8FE">
-      <w:numFmt w:val="decimal"/>
-      <w:lvlText w:val=""/>
-      <w:lvlJc w:val="left"/>
-    </w:lvl>
-    <w:lvl w:ilvl="4" w:tplc="F8C40880">
-      <w:numFmt w:val="decimal"/>
-      <w:lvlText w:val=""/>
-      <w:lvlJc w:val="left"/>
-    </w:lvl>
-    <w:lvl w:ilvl="5" w:tplc="82DE0910">
-      <w:numFmt w:val="decimal"/>
-      <w:lvlText w:val=""/>
-      <w:lvlJc w:val="left"/>
-    </w:lvl>
-    <w:lvl w:ilvl="6" w:tplc="16D2EC58">
-      <w:numFmt w:val="decimal"/>
-      <w:lvlText w:val=""/>
-      <w:lvlJc w:val="left"/>
-    </w:lvl>
-    <w:lvl w:ilvl="7" w:tplc="864A6CF4">
-      <w:numFmt w:val="decimal"/>
-      <w:lvlText w:val=""/>
-      <w:lvlJc w:val="left"/>
-    </w:lvl>
-    <w:lvl w:ilvl="8" w:tplc="6136AAC8">
-      <w:numFmt w:val="decimal"/>
-      <w:lvlText w:val=""/>
-      <w:lvlJc w:val="left"/>
-    </w:lvl>
-  </w:abstractNum>
-  <w:abstractNum w:abstractNumId="1" w15:restartNumberingAfterBreak="0">
-    <w:nsid w:val="3AB31CE2"/>
-    <w:multiLevelType w:val="hybridMultilevel"/>
-    <w:tmpl w:val="9928312A"/>
-    <w:lvl w:ilvl="0" w:tplc="6FF8EA2E">
+    <w:tmpl w:val="AD005CD6"/>
+    <w:lvl w:ilvl="0" w:tplc="F9BAD854">
       <w:start w:val="1"/>
       <w:numFmt w:val="decimal"/>
       <w:lvlText w:val="%1."/>
@@ -7087,52 +7033,52 @@
         <w:ind w:left="560" w:hanging="340"/>
       </w:pPr>
     </w:lvl>
-    <w:lvl w:ilvl="1" w:tplc="91585AE6">
+    <w:lvl w:ilvl="1" w:tplc="BE6CACDE">
       <w:numFmt w:val="decimal"/>
       <w:lvlText w:val=""/>
       <w:lvlJc w:val="left"/>
     </w:lvl>
-    <w:lvl w:ilvl="2" w:tplc="B9E86B58">
+    <w:lvl w:ilvl="2" w:tplc="7504A6C2">
       <w:numFmt w:val="decimal"/>
       <w:lvlText w:val=""/>
       <w:lvlJc w:val="left"/>
     </w:lvl>
-    <w:lvl w:ilvl="3" w:tplc="A0708202">
+    <w:lvl w:ilvl="3" w:tplc="D10EA8BC">
       <w:numFmt w:val="decimal"/>
       <w:lvlText w:val=""/>
       <w:lvlJc w:val="left"/>
     </w:lvl>
-    <w:lvl w:ilvl="4" w:tplc="1C00A1E0">
+    <w:lvl w:ilvl="4" w:tplc="DB3E8A04">
       <w:numFmt w:val="decimal"/>
       <w:lvlText w:val=""/>
       <w:lvlJc w:val="left"/>
     </w:lvl>
-    <w:lvl w:ilvl="5" w:tplc="A2B22B82">
+    <w:lvl w:ilvl="5" w:tplc="27E49B22">
       <w:numFmt w:val="decimal"/>
       <w:lvlText w:val=""/>
       <w:lvlJc w:val="left"/>
     </w:lvl>
-    <w:lvl w:ilvl="6" w:tplc="76284E56">
+    <w:lvl w:ilvl="6" w:tplc="D4F2C716">
       <w:numFmt w:val="decimal"/>
       <w:lvlText w:val=""/>
       <w:lvlJc w:val="left"/>
     </w:lvl>
-    <w:lvl w:ilvl="7" w:tplc="9F52A10A">
+    <w:lvl w:ilvl="7" w:tplc="51602E7A">
       <w:numFmt w:val="decimal"/>
       <w:lvlText w:val=""/>
       <w:lvlJc w:val="left"/>
     </w:lvl>
-    <w:lvl w:ilvl="8" w:tplc="A84E6164">
+    <w:lvl w:ilvl="8" w:tplc="5308EF18">
       <w:numFmt w:val="decimal"/>
       <w:lvlText w:val=""/>
       <w:lvlJc w:val="left"/>
     </w:lvl>
   </w:abstractNum>
-  <w:abstractNum w:abstractNumId="2" w15:restartNumberingAfterBreak="0">
-    <w:nsid w:val="51EF12A2"/>
+  <w:abstractNum w:abstractNumId="1" w15:restartNumberingAfterBreak="0">
+    <w:nsid w:val="46E92530"/>
     <w:multiLevelType w:val="hybridMultilevel"/>
-    <w:tmpl w:val="0928C16C"/>
-    <w:lvl w:ilvl="0" w:tplc="F634D89C">
+    <w:tmpl w:val="B6AA26CE"/>
+    <w:lvl w:ilvl="0" w:tplc="26A861AC">
       <w:start w:val="1"/>
       <w:numFmt w:val="bullet"/>
       <w:lvlText w:val="●"/>
@@ -7141,7 +7087,7 @@
         <w:ind w:left="720" w:hanging="360"/>
       </w:pPr>
     </w:lvl>
-    <w:lvl w:ilvl="1" w:tplc="5CACA550">
+    <w:lvl w:ilvl="1" w:tplc="9710A8DC">
       <w:start w:val="1"/>
       <w:numFmt w:val="bullet"/>
       <w:lvlText w:val="○"/>
@@ -7150,7 +7096,7 @@
         <w:ind w:left="1440" w:hanging="360"/>
       </w:pPr>
     </w:lvl>
-    <w:lvl w:ilvl="2" w:tplc="8B8E2CAA">
+    <w:lvl w:ilvl="2" w:tplc="9C1209F4">
       <w:start w:val="1"/>
       <w:numFmt w:val="bullet"/>
       <w:lvlText w:val="■"/>
@@ -7159,7 +7105,7 @@
         <w:ind w:left="2160" w:hanging="360"/>
       </w:pPr>
     </w:lvl>
-    <w:lvl w:ilvl="3" w:tplc="EC087802">
+    <w:lvl w:ilvl="3" w:tplc="17187B46">
       <w:start w:val="1"/>
       <w:numFmt w:val="bullet"/>
       <w:lvlText w:val="●"/>
@@ -7168,7 +7114,7 @@
         <w:ind w:left="2880" w:hanging="360"/>
       </w:pPr>
     </w:lvl>
-    <w:lvl w:ilvl="4" w:tplc="7E2E4C82">
+    <w:lvl w:ilvl="4" w:tplc="9EB297F2">
       <w:start w:val="1"/>
       <w:numFmt w:val="bullet"/>
       <w:lvlText w:val="○"/>
@@ -7177,7 +7123,7 @@
         <w:ind w:left="3600" w:hanging="360"/>
       </w:pPr>
     </w:lvl>
-    <w:lvl w:ilvl="5" w:tplc="A9FA4FEC">
+    <w:lvl w:ilvl="5" w:tplc="CD32AF6E">
       <w:start w:val="1"/>
       <w:numFmt w:val="bullet"/>
       <w:lvlText w:val="■"/>
@@ -7186,7 +7132,7 @@
         <w:ind w:left="4320" w:hanging="360"/>
       </w:pPr>
     </w:lvl>
-    <w:lvl w:ilvl="6" w:tplc="8B1423E6">
+    <w:lvl w:ilvl="6" w:tplc="976EFC72">
       <w:start w:val="1"/>
       <w:numFmt w:val="bullet"/>
       <w:lvlText w:val="●"/>
@@ -7195,7 +7141,7 @@
         <w:ind w:left="5040" w:hanging="360"/>
       </w:pPr>
     </w:lvl>
-    <w:lvl w:ilvl="7" w:tplc="8DAECF78">
+    <w:lvl w:ilvl="7" w:tplc="291C748E">
       <w:start w:val="1"/>
       <w:numFmt w:val="bullet"/>
       <w:lvlText w:val="●"/>
@@ -7204,7 +7150,7 @@
         <w:ind w:left="5760" w:hanging="360"/>
       </w:pPr>
     </w:lvl>
-    <w:lvl w:ilvl="8" w:tplc="D210607C">
+    <w:lvl w:ilvl="8" w:tplc="061EE6C4">
       <w:start w:val="1"/>
       <w:numFmt w:val="bullet"/>
       <w:lvlText w:val="●"/>
@@ -7214,8 +7160,62 @@
       </w:pPr>
     </w:lvl>
   </w:abstractNum>
-  <w:num w:numId="1" w16cid:durableId="1460882828">
-    <w:abstractNumId w:val="2"/>
+  <w:abstractNum w:abstractNumId="2" w15:restartNumberingAfterBreak="0">
+    <w:nsid w:val="7D6A27DA"/>
+    <w:multiLevelType w:val="hybridMultilevel"/>
+    <w:tmpl w:val="37DE96CC"/>
+    <w:lvl w:ilvl="0" w:tplc="B4E07B1E">
+      <w:start w:val="1"/>
+      <w:numFmt w:val="bullet"/>
+      <w:lvlText w:val="•"/>
+      <w:lvlJc w:val="left"/>
+      <w:pPr>
+        <w:ind w:left="560" w:hanging="280"/>
+      </w:pPr>
+    </w:lvl>
+    <w:lvl w:ilvl="1" w:tplc="B83202FC">
+      <w:numFmt w:val="decimal"/>
+      <w:lvlText w:val=""/>
+      <w:lvlJc w:val="left"/>
+    </w:lvl>
+    <w:lvl w:ilvl="2" w:tplc="E4CACEA2">
+      <w:numFmt w:val="decimal"/>
+      <w:lvlText w:val=""/>
+      <w:lvlJc w:val="left"/>
+    </w:lvl>
+    <w:lvl w:ilvl="3" w:tplc="D89684E0">
+      <w:numFmt w:val="decimal"/>
+      <w:lvlText w:val=""/>
+      <w:lvlJc w:val="left"/>
+    </w:lvl>
+    <w:lvl w:ilvl="4" w:tplc="25E2A2F8">
+      <w:numFmt w:val="decimal"/>
+      <w:lvlText w:val=""/>
+      <w:lvlJc w:val="left"/>
+    </w:lvl>
+    <w:lvl w:ilvl="5" w:tplc="A498F536">
+      <w:numFmt w:val="decimal"/>
+      <w:lvlText w:val=""/>
+      <w:lvlJc w:val="left"/>
+    </w:lvl>
+    <w:lvl w:ilvl="6" w:tplc="B1569B86">
+      <w:numFmt w:val="decimal"/>
+      <w:lvlText w:val=""/>
+      <w:lvlJc w:val="left"/>
+    </w:lvl>
+    <w:lvl w:ilvl="7" w:tplc="F4249D8A">
+      <w:numFmt w:val="decimal"/>
+      <w:lvlText w:val=""/>
+      <w:lvlJc w:val="left"/>
+    </w:lvl>
+    <w:lvl w:ilvl="8" w:tplc="2706935A">
+      <w:numFmt w:val="decimal"/>
+      <w:lvlText w:val=""/>
+      <w:lvlJc w:val="left"/>
+    </w:lvl>
+  </w:abstractNum>
+  <w:num w:numId="1" w16cid:durableId="1790318541">
+    <w:abstractNumId w:val="1"/>
     <w:lvlOverride w:ilvl="0">
       <w:startOverride w:val="1"/>
     </w:lvlOverride>
@@ -7807,7 +7807,7 @@
     <w:autoRedefine/>
     <w:uiPriority w:val="39"/>
     <w:unhideWhenUsed/>
-    <w:rsid w:val="00A04E69"/>
+    <w:rsid w:val="00883894"/>
     <w:pPr>
       <w:spacing w:after="100"/>
     </w:pPr>

</xml_diff>

<commit_message>
Reunión de inicio, canal por el Product Owner y avance por EDT N.º 2
- Acta de la reunión de inicio del 12/10/2026 (GOB-12), emitida para firma.
- Acta de constitución firmada; conformidad de la patrocinadora con SC-02 y
  SC-03; nuevo cambio SC-11 (comunicación con el colegio a través del
  Product Owner, Helber Perez); IN-03, IN-05 e IN-10 cerrados; R-08 y S-12.
- Plan, registro y monitoreo de las comunicaciones (INT-03 v1.2, INT-06,
  INT-07 N.º 2) con corte al 17/10/2026: avances los sábados, aviso a los
  apoderados por WhatsApp de los tutores y margen de siete días por confirmar.
- Informe de avance por EDT N.º 2 (ALC-05): presenta el entregable E-01 con
  sus casos de prueba y el avance de cada paquete.

Co-Authored-By: Claude Opus 5.5 <noreply@anthropic.com>
</commit_message>
<xml_diff>
--- a/public/documentos/ALC-01-plan-de-gestion-del-alcance-y-de-los-requisitos.docx
+++ b/public/documentos/ALC-01-plan-de-gestion-del-alcance-y-de-los-requisitos.docx
@@ -52,7 +52,7 @@
                 <w:noProof/>
               </w:rPr>
               <w:drawing>
-                <wp:inline distT="0" distB="0" distL="0" distR="0" wp14:anchorId="4B4058F0" wp14:editId="7EA0CB92">
+                <wp:inline distT="0" distB="0" distL="0" distR="0" wp14:anchorId="6A9F90D6" wp14:editId="0684604D">
                   <wp:extent cx="990600" cy="990600"/>
                   <wp:effectExtent l="0" t="0" r="0" b="0"/>
                   <wp:docPr id="1" name="Imagen 1"/>
@@ -171,10 +171,10 @@
                 <w:noProof/>
               </w:rPr>
               <w:drawing>
-                <wp:inline distT="0" distB="0" distL="0" distR="0" wp14:anchorId="79AE9ED1" wp14:editId="3B0F9EA7">
+                <wp:inline distT="0" distB="0" distL="0" distR="0" wp14:anchorId="1F6F156F" wp14:editId="0396044B">
                   <wp:extent cx="800100" cy="800100"/>
                   <wp:effectExtent l="0" t="0" r="0" b="0"/>
-                  <wp:docPr id="624520274" name="Imagen 624520274"/>
+                  <wp:docPr id="2081567918" name="Imagen 2081567918"/>
                   <wp:cNvGraphicFramePr>
                     <a:graphicFrameLocks xmlns:a="http://schemas.openxmlformats.org/drawingml/2006/main" noChangeAspect="1"/>
                   </wp:cNvGraphicFramePr>
@@ -1117,7 +1117,7 @@
                 <w:sz w:val="17"/>
                 <w:szCs w:val="17"/>
               </w:rPr>
-              <w:t>Responsable del modelo de Machine Learning</w:t>
+              <w:t>Responsable del modelo de Machine Learning y Product Owner</w:t>
             </w:r>
           </w:p>
         </w:tc>
@@ -2585,7 +2585,7 @@
     <w:sdt>
       <w:sdtPr>
         <w:alias w:val="Contenido"/>
-        <w:id w:val="236676651"/>
+        <w:id w:val="-1892885585"/>
       </w:sdtPr>
       <w:sdtEndPr/>
       <w:sdtContent>
@@ -2611,7 +2611,7 @@
           <w:r>
             <w:fldChar w:fldCharType="separate"/>
           </w:r>
-          <w:hyperlink w:anchor="_Toc242549692" w:history="1">
+          <w:hyperlink w:anchor="_Toc243091752" w:history="1">
             <w:r>
               <w:rPr>
                 <w:rStyle w:val="Hipervnculo"/>
@@ -2635,7 +2635,7 @@
               <w:rPr>
                 <w:noProof/>
               </w:rPr>
-              <w:instrText xml:space="preserve"> PAGEREF _Toc242549692 \h </w:instrText>
+              <w:instrText xml:space="preserve"> PAGEREF _Toc243091752 \h </w:instrText>
             </w:r>
             <w:r>
               <w:rPr>
@@ -2675,7 +2675,7 @@
               <w14:ligatures w14:val="standardContextual"/>
             </w:rPr>
           </w:pPr>
-          <w:hyperlink w:anchor="_Toc242549693" w:history="1">
+          <w:hyperlink w:anchor="_Toc243091753" w:history="1">
             <w:r>
               <w:rPr>
                 <w:rStyle w:val="Hipervnculo"/>
@@ -2699,7 +2699,7 @@
               <w:rPr>
                 <w:noProof/>
               </w:rPr>
-              <w:instrText xml:space="preserve"> PAGEREF _Toc242549693 \h </w:instrText>
+              <w:instrText xml:space="preserve"> PAGEREF _Toc243091753 \h </w:instrText>
             </w:r>
             <w:r>
               <w:rPr>
@@ -2739,7 +2739,7 @@
               <w14:ligatures w14:val="standardContextual"/>
             </w:rPr>
           </w:pPr>
-          <w:hyperlink w:anchor="_Toc242549694" w:history="1">
+          <w:hyperlink w:anchor="_Toc243091754" w:history="1">
             <w:r>
               <w:rPr>
                 <w:rStyle w:val="Hipervnculo"/>
@@ -2763,7 +2763,7 @@
               <w:rPr>
                 <w:noProof/>
               </w:rPr>
-              <w:instrText xml:space="preserve"> PAGEREF _Toc242549694 \h </w:instrText>
+              <w:instrText xml:space="preserve"> PAGEREF _Toc243091754 \h </w:instrText>
             </w:r>
             <w:r>
               <w:rPr>
@@ -2803,7 +2803,7 @@
               <w14:ligatures w14:val="standardContextual"/>
             </w:rPr>
           </w:pPr>
-          <w:hyperlink w:anchor="_Toc242549695" w:history="1">
+          <w:hyperlink w:anchor="_Toc243091755" w:history="1">
             <w:r>
               <w:rPr>
                 <w:rStyle w:val="Hipervnculo"/>
@@ -2827,7 +2827,7 @@
               <w:rPr>
                 <w:noProof/>
               </w:rPr>
-              <w:instrText xml:space="preserve"> PAGEREF _Toc242549695 \h </w:instrText>
+              <w:instrText xml:space="preserve"> PAGEREF _Toc243091755 \h </w:instrText>
             </w:r>
             <w:r>
               <w:rPr>
@@ -2867,7 +2867,7 @@
               <w14:ligatures w14:val="standardContextual"/>
             </w:rPr>
           </w:pPr>
-          <w:hyperlink w:anchor="_Toc242549696" w:history="1">
+          <w:hyperlink w:anchor="_Toc243091756" w:history="1">
             <w:r>
               <w:rPr>
                 <w:rStyle w:val="Hipervnculo"/>
@@ -2891,7 +2891,7 @@
               <w:rPr>
                 <w:noProof/>
               </w:rPr>
-              <w:instrText xml:space="preserve"> PAGEREF _Toc242549696 \h </w:instrText>
+              <w:instrText xml:space="preserve"> PAGEREF _Toc243091756 \h </w:instrText>
             </w:r>
             <w:r>
               <w:rPr>
@@ -2931,7 +2931,7 @@
               <w14:ligatures w14:val="standardContextual"/>
             </w:rPr>
           </w:pPr>
-          <w:hyperlink w:anchor="_Toc242549697" w:history="1">
+          <w:hyperlink w:anchor="_Toc243091757" w:history="1">
             <w:r>
               <w:rPr>
                 <w:rStyle w:val="Hipervnculo"/>
@@ -2955,7 +2955,7 @@
               <w:rPr>
                 <w:noProof/>
               </w:rPr>
-              <w:instrText xml:space="preserve"> PAGEREF _Toc242549697 \h </w:instrText>
+              <w:instrText xml:space="preserve"> PAGEREF _Toc243091757 \h </w:instrText>
             </w:r>
             <w:r>
               <w:rPr>
@@ -3005,7 +3005,7 @@
       <w:pPr>
         <w:pStyle w:val="Ttulo1"/>
       </w:pPr>
-      <w:bookmarkStart w:id="0" w:name="_Toc242549692"/>
+      <w:bookmarkStart w:id="0" w:name="_Toc243091752"/>
       <w:r>
         <w:lastRenderedPageBreak/>
         <w:t>1. Propósito y enfoque</w:t>
@@ -3054,7 +3054,7 @@
       <w:pPr>
         <w:pStyle w:val="Ttulo1"/>
       </w:pPr>
-      <w:bookmarkStart w:id="1" w:name="_Toc242549693"/>
+      <w:bookmarkStart w:id="1" w:name="_Toc243091753"/>
       <w:r>
         <w:t>2. Procesos del alcance en este proyecto</w:t>
       </w:r>
@@ -3979,7 +3979,7 @@
       <w:pPr>
         <w:pStyle w:val="Ttulo1"/>
       </w:pPr>
-      <w:bookmarkStart w:id="2" w:name="_Toc242549694"/>
+      <w:bookmarkStart w:id="2" w:name="_Toc243091754"/>
       <w:r>
         <w:t>3. Gestión de los requisitos</w:t>
       </w:r>
@@ -4518,7 +4518,7 @@
       <w:pPr>
         <w:pStyle w:val="Ttulo1"/>
       </w:pPr>
-      <w:bookmarkStart w:id="3" w:name="_Toc242549695"/>
+      <w:bookmarkStart w:id="3" w:name="_Toc243091755"/>
       <w:r>
         <w:t>4. Métricas del alcance</w:t>
       </w:r>
@@ -5586,7 +5586,7 @@
       <w:pPr>
         <w:pStyle w:val="Ttulo1"/>
       </w:pPr>
-      <w:bookmarkStart w:id="4" w:name="_Toc242549696"/>
+      <w:bookmarkStart w:id="4" w:name="_Toc243091756"/>
       <w:r>
         <w:t>5. Línea base del alcance</w:t>
       </w:r>
@@ -6107,7 +6107,7 @@
       <w:pPr>
         <w:pStyle w:val="Ttulo1"/>
       </w:pPr>
-      <w:bookmarkStart w:id="5" w:name="_Toc242549697"/>
+      <w:bookmarkStart w:id="5" w:name="_Toc243091757"/>
       <w:r>
         <w:t>6. Roles</w:t>
       </w:r>
@@ -7021,10 +7021,10 @@
 <file path=word/numbering.xml><?xml version="1.0" encoding="utf-8"?>
 <w:numbering xmlns:wpc="http://schemas.microsoft.com/office/word/2010/wordprocessingCanvas" xmlns:cx="http://schemas.microsoft.com/office/drawing/2014/chartex" xmlns:cx1="http://schemas.microsoft.com/office/drawing/2015/9/8/chartex" xmlns:cx2="http://schemas.microsoft.com/office/drawing/2015/10/21/chartex" xmlns:cx3="http://schemas.microsoft.com/office/drawing/2016/5/9/chartex" xmlns:cx4="http://schemas.microsoft.com/office/drawing/2016/5/10/chartex" xmlns:cx5="http://schemas.microsoft.com/office/drawing/2016/5/11/chartex" xmlns:cx6="http://schemas.microsoft.com/office/drawing/2016/5/12/chartex" xmlns:cx7="http://schemas.microsoft.com/office/drawing/2016/5/13/chartex" xmlns:cx8="http://schemas.microsoft.com/office/drawing/2016/5/14/chartex" xmlns:mc="http://schemas.openxmlformats.org/markup-compatibility/2006" xmlns:aink="http://schemas.microsoft.com/office/drawing/2016/ink" xmlns:am3d="http://schemas.microsoft.com/office/drawing/2017/model3d" xmlns:o="urn:schemas-microsoft-com:office:office" xmlns:oel="http://schemas.microsoft.com/office/2019/extlst" xmlns:r="http://schemas.openxmlformats.org/officeDocument/2006/relationships" xmlns:m="http://schemas.openxmlformats.org/officeDocument/2006/math" xmlns:v="urn:schemas-microsoft-com:vml" xmlns:wp14="http://schemas.microsoft.com/office/word/2010/wordprocessingDrawing" xmlns:wp="http://schemas.openxmlformats.org/drawingml/2006/wordprocessingDrawing" xmlns:w10="urn:schemas-microsoft-com:office:word" xmlns:w="http://schemas.openxmlformats.org/wordprocessingml/2006/main" xmlns:w14="http://schemas.microsoft.com/office/word/2010/wordml" xmlns:w15="http://schemas.microsoft.com/office/word/2012/wordml" xmlns:w16cex="http://schemas.microsoft.com/office/word/2018/wordml/cex" xmlns:w16cid="http://schemas.microsoft.com/office/word/2016/wordml/cid" xmlns:w16="http://schemas.microsoft.com/office/word/2018/wordml" xmlns:w16du="http://schemas.microsoft.com/office/word/2023/wordml/word16du" xmlns:w16sdtdh="http://schemas.microsoft.com/office/word/2020/wordml/sdtdatahash" xmlns:w16sdtfl="http://schemas.microsoft.com/office/word/2024/wordml/sdtformatlock" xmlns:w16se="http://schemas.microsoft.com/office/word/2015/wordml/symex" xmlns:wpg="http://schemas.microsoft.com/office/word/2010/wordprocessingGroup" xmlns:wpi="http://schemas.microsoft.com/office/word/2010/wordprocessingInk" xmlns:wne="http://schemas.microsoft.com/office/word/2006/wordml" xmlns:wps="http://schemas.microsoft.com/office/word/2010/wordprocessingShape" mc:Ignorable="w14 w15 w16se w16cid w16 w16cex w16sdtdh w16sdtfl w16du wp14">
   <w:abstractNum w:abstractNumId="0" w15:restartNumberingAfterBreak="0">
-    <w:nsid w:val="2BD71B23"/>
+    <w:nsid w:val="1EE16662"/>
     <w:multiLevelType w:val="hybridMultilevel"/>
-    <w:tmpl w:val="AD005CD6"/>
-    <w:lvl w:ilvl="0" w:tplc="F9BAD854">
+    <w:tmpl w:val="1CAE7F4A"/>
+    <w:lvl w:ilvl="0" w:tplc="A470D2FC">
       <w:start w:val="1"/>
       <w:numFmt w:val="decimal"/>
       <w:lvlText w:val="%1."/>
@@ -7033,52 +7033,52 @@
         <w:ind w:left="560" w:hanging="340"/>
       </w:pPr>
     </w:lvl>
-    <w:lvl w:ilvl="1" w:tplc="BE6CACDE">
+    <w:lvl w:ilvl="1" w:tplc="8D625474">
       <w:numFmt w:val="decimal"/>
       <w:lvlText w:val=""/>
       <w:lvlJc w:val="left"/>
     </w:lvl>
-    <w:lvl w:ilvl="2" w:tplc="7504A6C2">
+    <w:lvl w:ilvl="2" w:tplc="35EE7CA2">
       <w:numFmt w:val="decimal"/>
       <w:lvlText w:val=""/>
       <w:lvlJc w:val="left"/>
     </w:lvl>
-    <w:lvl w:ilvl="3" w:tplc="D10EA8BC">
+    <w:lvl w:ilvl="3" w:tplc="DE9A63C8">
       <w:numFmt w:val="decimal"/>
       <w:lvlText w:val=""/>
       <w:lvlJc w:val="left"/>
     </w:lvl>
-    <w:lvl w:ilvl="4" w:tplc="DB3E8A04">
+    <w:lvl w:ilvl="4" w:tplc="894EF68C">
       <w:numFmt w:val="decimal"/>
       <w:lvlText w:val=""/>
       <w:lvlJc w:val="left"/>
     </w:lvl>
-    <w:lvl w:ilvl="5" w:tplc="27E49B22">
+    <w:lvl w:ilvl="5" w:tplc="F1FCE9B4">
       <w:numFmt w:val="decimal"/>
       <w:lvlText w:val=""/>
       <w:lvlJc w:val="left"/>
     </w:lvl>
-    <w:lvl w:ilvl="6" w:tplc="D4F2C716">
+    <w:lvl w:ilvl="6" w:tplc="2C44AF0E">
       <w:numFmt w:val="decimal"/>
       <w:lvlText w:val=""/>
       <w:lvlJc w:val="left"/>
     </w:lvl>
-    <w:lvl w:ilvl="7" w:tplc="51602E7A">
+    <w:lvl w:ilvl="7" w:tplc="35D8EA06">
       <w:numFmt w:val="decimal"/>
       <w:lvlText w:val=""/>
       <w:lvlJc w:val="left"/>
     </w:lvl>
-    <w:lvl w:ilvl="8" w:tplc="5308EF18">
+    <w:lvl w:ilvl="8" w:tplc="705AB804">
       <w:numFmt w:val="decimal"/>
       <w:lvlText w:val=""/>
       <w:lvlJc w:val="left"/>
     </w:lvl>
   </w:abstractNum>
   <w:abstractNum w:abstractNumId="1" w15:restartNumberingAfterBreak="0">
-    <w:nsid w:val="46E92530"/>
+    <w:nsid w:val="278D7972"/>
     <w:multiLevelType w:val="hybridMultilevel"/>
-    <w:tmpl w:val="B6AA26CE"/>
-    <w:lvl w:ilvl="0" w:tplc="26A861AC">
+    <w:tmpl w:val="BEAEC680"/>
+    <w:lvl w:ilvl="0" w:tplc="CC36E3E4">
       <w:start w:val="1"/>
       <w:numFmt w:val="bullet"/>
       <w:lvlText w:val="●"/>
@@ -7087,7 +7087,7 @@
         <w:ind w:left="720" w:hanging="360"/>
       </w:pPr>
     </w:lvl>
-    <w:lvl w:ilvl="1" w:tplc="9710A8DC">
+    <w:lvl w:ilvl="1" w:tplc="2FE01586">
       <w:start w:val="1"/>
       <w:numFmt w:val="bullet"/>
       <w:lvlText w:val="○"/>
@@ -7096,7 +7096,7 @@
         <w:ind w:left="1440" w:hanging="360"/>
       </w:pPr>
     </w:lvl>
-    <w:lvl w:ilvl="2" w:tplc="9C1209F4">
+    <w:lvl w:ilvl="2" w:tplc="1C229D2A">
       <w:start w:val="1"/>
       <w:numFmt w:val="bullet"/>
       <w:lvlText w:val="■"/>
@@ -7105,7 +7105,7 @@
         <w:ind w:left="2160" w:hanging="360"/>
       </w:pPr>
     </w:lvl>
-    <w:lvl w:ilvl="3" w:tplc="17187B46">
+    <w:lvl w:ilvl="3" w:tplc="EBEEB80E">
       <w:start w:val="1"/>
       <w:numFmt w:val="bullet"/>
       <w:lvlText w:val="●"/>
@@ -7114,7 +7114,7 @@
         <w:ind w:left="2880" w:hanging="360"/>
       </w:pPr>
     </w:lvl>
-    <w:lvl w:ilvl="4" w:tplc="9EB297F2">
+    <w:lvl w:ilvl="4" w:tplc="8C96CA72">
       <w:start w:val="1"/>
       <w:numFmt w:val="bullet"/>
       <w:lvlText w:val="○"/>
@@ -7123,7 +7123,7 @@
         <w:ind w:left="3600" w:hanging="360"/>
       </w:pPr>
     </w:lvl>
-    <w:lvl w:ilvl="5" w:tplc="CD32AF6E">
+    <w:lvl w:ilvl="5" w:tplc="22C09A8E">
       <w:start w:val="1"/>
       <w:numFmt w:val="bullet"/>
       <w:lvlText w:val="■"/>
@@ -7132,7 +7132,7 @@
         <w:ind w:left="4320" w:hanging="360"/>
       </w:pPr>
     </w:lvl>
-    <w:lvl w:ilvl="6" w:tplc="976EFC72">
+    <w:lvl w:ilvl="6" w:tplc="E52E9412">
       <w:start w:val="1"/>
       <w:numFmt w:val="bullet"/>
       <w:lvlText w:val="●"/>
@@ -7141,7 +7141,7 @@
         <w:ind w:left="5040" w:hanging="360"/>
       </w:pPr>
     </w:lvl>
-    <w:lvl w:ilvl="7" w:tplc="291C748E">
+    <w:lvl w:ilvl="7" w:tplc="0C0EED42">
       <w:start w:val="1"/>
       <w:numFmt w:val="bullet"/>
       <w:lvlText w:val="●"/>
@@ -7150,7 +7150,7 @@
         <w:ind w:left="5760" w:hanging="360"/>
       </w:pPr>
     </w:lvl>
-    <w:lvl w:ilvl="8" w:tplc="061EE6C4">
+    <w:lvl w:ilvl="8" w:tplc="A9A807A6">
       <w:start w:val="1"/>
       <w:numFmt w:val="bullet"/>
       <w:lvlText w:val="●"/>
@@ -7161,10 +7161,10 @@
     </w:lvl>
   </w:abstractNum>
   <w:abstractNum w:abstractNumId="2" w15:restartNumberingAfterBreak="0">
-    <w:nsid w:val="7D6A27DA"/>
+    <w:nsid w:val="750A4BDD"/>
     <w:multiLevelType w:val="hybridMultilevel"/>
-    <w:tmpl w:val="37DE96CC"/>
-    <w:lvl w:ilvl="0" w:tplc="B4E07B1E">
+    <w:tmpl w:val="26AC1EC6"/>
+    <w:lvl w:ilvl="0" w:tplc="F912E86C">
       <w:start w:val="1"/>
       <w:numFmt w:val="bullet"/>
       <w:lvlText w:val="•"/>
@@ -7173,48 +7173,48 @@
         <w:ind w:left="560" w:hanging="280"/>
       </w:pPr>
     </w:lvl>
-    <w:lvl w:ilvl="1" w:tplc="B83202FC">
+    <w:lvl w:ilvl="1" w:tplc="06F65F74">
       <w:numFmt w:val="decimal"/>
       <w:lvlText w:val=""/>
       <w:lvlJc w:val="left"/>
     </w:lvl>
-    <w:lvl w:ilvl="2" w:tplc="E4CACEA2">
+    <w:lvl w:ilvl="2" w:tplc="5A2CBF8A">
       <w:numFmt w:val="decimal"/>
       <w:lvlText w:val=""/>
       <w:lvlJc w:val="left"/>
     </w:lvl>
-    <w:lvl w:ilvl="3" w:tplc="D89684E0">
+    <w:lvl w:ilvl="3" w:tplc="8DAA4854">
       <w:numFmt w:val="decimal"/>
       <w:lvlText w:val=""/>
       <w:lvlJc w:val="left"/>
     </w:lvl>
-    <w:lvl w:ilvl="4" w:tplc="25E2A2F8">
+    <w:lvl w:ilvl="4" w:tplc="40C0746C">
       <w:numFmt w:val="decimal"/>
       <w:lvlText w:val=""/>
       <w:lvlJc w:val="left"/>
     </w:lvl>
-    <w:lvl w:ilvl="5" w:tplc="A498F536">
+    <w:lvl w:ilvl="5" w:tplc="BA8035E0">
       <w:numFmt w:val="decimal"/>
       <w:lvlText w:val=""/>
       <w:lvlJc w:val="left"/>
     </w:lvl>
-    <w:lvl w:ilvl="6" w:tplc="B1569B86">
+    <w:lvl w:ilvl="6" w:tplc="2550FAB2">
       <w:numFmt w:val="decimal"/>
       <w:lvlText w:val=""/>
       <w:lvlJc w:val="left"/>
     </w:lvl>
-    <w:lvl w:ilvl="7" w:tplc="F4249D8A">
+    <w:lvl w:ilvl="7" w:tplc="32C62B08">
       <w:numFmt w:val="decimal"/>
       <w:lvlText w:val=""/>
       <w:lvlJc w:val="left"/>
     </w:lvl>
-    <w:lvl w:ilvl="8" w:tplc="2706935A">
+    <w:lvl w:ilvl="8" w:tplc="3EA00D48">
       <w:numFmt w:val="decimal"/>
       <w:lvlText w:val=""/>
       <w:lvlJc w:val="left"/>
     </w:lvl>
   </w:abstractNum>
-  <w:num w:numId="1" w16cid:durableId="1790318541">
+  <w:num w:numId="1" w16cid:durableId="1107695007">
     <w:abstractNumId w:val="1"/>
     <w:lvlOverride w:ilvl="0">
       <w:startOverride w:val="1"/>
@@ -7807,7 +7807,7 @@
     <w:autoRedefine/>
     <w:uiPriority w:val="39"/>
     <w:unhideWhenUsed/>
-    <w:rsid w:val="00883894"/>
+    <w:rsid w:val="005C3B02"/>
     <w:pPr>
       <w:spacing w:after="100"/>
     </w:pPr>

</xml_diff>

<commit_message>
Modo oscuro con botón en el encabezado
El botón del encabezado alterna el modo oscuro y la preferencia queda
guardada en el navegador. La hoja modo-oscuro.css invierte la escala de
cada color de Tailwind y ajusta los colores fijos del blog. Se sube a la
versión 1.1 la documentación que cambió con la reunión de inicio.

Co-Authored-By: Claude Opus 5.5 <noreply@anthropic.com>
</commit_message>
<xml_diff>
--- a/public/documentos/ALC-01-plan-de-gestion-del-alcance-y-de-los-requisitos.docx
+++ b/public/documentos/ALC-01-plan-de-gestion-del-alcance-y-de-los-requisitos.docx
@@ -52,7 +52,7 @@
                 <w:noProof/>
               </w:rPr>
               <w:drawing>
-                <wp:inline distT="0" distB="0" distL="0" distR="0" wp14:anchorId="6A9F90D6" wp14:editId="0684604D">
+                <wp:inline distT="0" distB="0" distL="0" distR="0" wp14:anchorId="57F51413" wp14:editId="70101011">
                   <wp:extent cx="990600" cy="990600"/>
                   <wp:effectExtent l="0" t="0" r="0" b="0"/>
                   <wp:docPr id="1" name="Imagen 1"/>
@@ -171,10 +171,10 @@
                 <w:noProof/>
               </w:rPr>
               <w:drawing>
-                <wp:inline distT="0" distB="0" distL="0" distR="0" wp14:anchorId="1F6F156F" wp14:editId="0396044B">
+                <wp:inline distT="0" distB="0" distL="0" distR="0" wp14:anchorId="33453CFC" wp14:editId="02415D1A">
                   <wp:extent cx="800100" cy="800100"/>
                   <wp:effectExtent l="0" t="0" r="0" b="0"/>
-                  <wp:docPr id="2081567918" name="Imagen 2081567918"/>
+                  <wp:docPr id="1798205285" name="Imagen 1798205285"/>
                   <wp:cNvGraphicFramePr>
                     <a:graphicFrameLocks xmlns:a="http://schemas.openxmlformats.org/drawingml/2006/main" noChangeAspect="1"/>
                   </wp:cNvGraphicFramePr>
@@ -2585,7 +2585,7 @@
     <w:sdt>
       <w:sdtPr>
         <w:alias w:val="Contenido"/>
-        <w:id w:val="-1892885585"/>
+        <w:id w:val="1128901634"/>
       </w:sdtPr>
       <w:sdtEndPr/>
       <w:sdtContent>
@@ -2611,7 +2611,7 @@
           <w:r>
             <w:fldChar w:fldCharType="separate"/>
           </w:r>
-          <w:hyperlink w:anchor="_Toc243091752" w:history="1">
+          <w:hyperlink w:anchor="_Toc243093565" w:history="1">
             <w:r>
               <w:rPr>
                 <w:rStyle w:val="Hipervnculo"/>
@@ -2635,7 +2635,7 @@
               <w:rPr>
                 <w:noProof/>
               </w:rPr>
-              <w:instrText xml:space="preserve"> PAGEREF _Toc243091752 \h </w:instrText>
+              <w:instrText xml:space="preserve"> PAGEREF _Toc243093565 \h </w:instrText>
             </w:r>
             <w:r>
               <w:rPr>
@@ -2675,7 +2675,7 @@
               <w14:ligatures w14:val="standardContextual"/>
             </w:rPr>
           </w:pPr>
-          <w:hyperlink w:anchor="_Toc243091753" w:history="1">
+          <w:hyperlink w:anchor="_Toc243093566" w:history="1">
             <w:r>
               <w:rPr>
                 <w:rStyle w:val="Hipervnculo"/>
@@ -2699,7 +2699,7 @@
               <w:rPr>
                 <w:noProof/>
               </w:rPr>
-              <w:instrText xml:space="preserve"> PAGEREF _Toc243091753 \h </w:instrText>
+              <w:instrText xml:space="preserve"> PAGEREF _Toc243093566 \h </w:instrText>
             </w:r>
             <w:r>
               <w:rPr>
@@ -2739,7 +2739,7 @@
               <w14:ligatures w14:val="standardContextual"/>
             </w:rPr>
           </w:pPr>
-          <w:hyperlink w:anchor="_Toc243091754" w:history="1">
+          <w:hyperlink w:anchor="_Toc243093567" w:history="1">
             <w:r>
               <w:rPr>
                 <w:rStyle w:val="Hipervnculo"/>
@@ -2763,7 +2763,7 @@
               <w:rPr>
                 <w:noProof/>
               </w:rPr>
-              <w:instrText xml:space="preserve"> PAGEREF _Toc243091754 \h </w:instrText>
+              <w:instrText xml:space="preserve"> PAGEREF _Toc243093567 \h </w:instrText>
             </w:r>
             <w:r>
               <w:rPr>
@@ -2803,7 +2803,7 @@
               <w14:ligatures w14:val="standardContextual"/>
             </w:rPr>
           </w:pPr>
-          <w:hyperlink w:anchor="_Toc243091755" w:history="1">
+          <w:hyperlink w:anchor="_Toc243093568" w:history="1">
             <w:r>
               <w:rPr>
                 <w:rStyle w:val="Hipervnculo"/>
@@ -2827,7 +2827,7 @@
               <w:rPr>
                 <w:noProof/>
               </w:rPr>
-              <w:instrText xml:space="preserve"> PAGEREF _Toc243091755 \h </w:instrText>
+              <w:instrText xml:space="preserve"> PAGEREF _Toc243093568 \h </w:instrText>
             </w:r>
             <w:r>
               <w:rPr>
@@ -2867,7 +2867,7 @@
               <w14:ligatures w14:val="standardContextual"/>
             </w:rPr>
           </w:pPr>
-          <w:hyperlink w:anchor="_Toc243091756" w:history="1">
+          <w:hyperlink w:anchor="_Toc243093569" w:history="1">
             <w:r>
               <w:rPr>
                 <w:rStyle w:val="Hipervnculo"/>
@@ -2891,7 +2891,7 @@
               <w:rPr>
                 <w:noProof/>
               </w:rPr>
-              <w:instrText xml:space="preserve"> PAGEREF _Toc243091756 \h </w:instrText>
+              <w:instrText xml:space="preserve"> PAGEREF _Toc243093569 \h </w:instrText>
             </w:r>
             <w:r>
               <w:rPr>
@@ -2931,7 +2931,7 @@
               <w14:ligatures w14:val="standardContextual"/>
             </w:rPr>
           </w:pPr>
-          <w:hyperlink w:anchor="_Toc243091757" w:history="1">
+          <w:hyperlink w:anchor="_Toc243093570" w:history="1">
             <w:r>
               <w:rPr>
                 <w:rStyle w:val="Hipervnculo"/>
@@ -2955,7 +2955,7 @@
               <w:rPr>
                 <w:noProof/>
               </w:rPr>
-              <w:instrText xml:space="preserve"> PAGEREF _Toc243091757 \h </w:instrText>
+              <w:instrText xml:space="preserve"> PAGEREF _Toc243093570 \h </w:instrText>
             </w:r>
             <w:r>
               <w:rPr>
@@ -3005,7 +3005,7 @@
       <w:pPr>
         <w:pStyle w:val="Ttulo1"/>
       </w:pPr>
-      <w:bookmarkStart w:id="0" w:name="_Toc243091752"/>
+      <w:bookmarkStart w:id="0" w:name="_Toc243093565"/>
       <w:r>
         <w:lastRenderedPageBreak/>
         <w:t>1. Propósito y enfoque</w:t>
@@ -3054,7 +3054,7 @@
       <w:pPr>
         <w:pStyle w:val="Ttulo1"/>
       </w:pPr>
-      <w:bookmarkStart w:id="1" w:name="_Toc243091753"/>
+      <w:bookmarkStart w:id="1" w:name="_Toc243093566"/>
       <w:r>
         <w:t>2. Procesos del alcance en este proyecto</w:t>
       </w:r>
@@ -3979,7 +3979,7 @@
       <w:pPr>
         <w:pStyle w:val="Ttulo1"/>
       </w:pPr>
-      <w:bookmarkStart w:id="2" w:name="_Toc243091754"/>
+      <w:bookmarkStart w:id="2" w:name="_Toc243093567"/>
       <w:r>
         <w:t>3. Gestión de los requisitos</w:t>
       </w:r>
@@ -4518,7 +4518,7 @@
       <w:pPr>
         <w:pStyle w:val="Ttulo1"/>
       </w:pPr>
-      <w:bookmarkStart w:id="3" w:name="_Toc243091755"/>
+      <w:bookmarkStart w:id="3" w:name="_Toc243093568"/>
       <w:r>
         <w:t>4. Métricas del alcance</w:t>
       </w:r>
@@ -5586,7 +5586,7 @@
       <w:pPr>
         <w:pStyle w:val="Ttulo1"/>
       </w:pPr>
-      <w:bookmarkStart w:id="4" w:name="_Toc243091756"/>
+      <w:bookmarkStart w:id="4" w:name="_Toc243093569"/>
       <w:r>
         <w:t>5. Línea base del alcance</w:t>
       </w:r>
@@ -6107,7 +6107,7 @@
       <w:pPr>
         <w:pStyle w:val="Ttulo1"/>
       </w:pPr>
-      <w:bookmarkStart w:id="5" w:name="_Toc243091757"/>
+      <w:bookmarkStart w:id="5" w:name="_Toc243093570"/>
       <w:r>
         <w:t>6. Roles</w:t>
       </w:r>
@@ -7021,10 +7021,10 @@
 <file path=word/numbering.xml><?xml version="1.0" encoding="utf-8"?>
 <w:numbering xmlns:wpc="http://schemas.microsoft.com/office/word/2010/wordprocessingCanvas" xmlns:cx="http://schemas.microsoft.com/office/drawing/2014/chartex" xmlns:cx1="http://schemas.microsoft.com/office/drawing/2015/9/8/chartex" xmlns:cx2="http://schemas.microsoft.com/office/drawing/2015/10/21/chartex" xmlns:cx3="http://schemas.microsoft.com/office/drawing/2016/5/9/chartex" xmlns:cx4="http://schemas.microsoft.com/office/drawing/2016/5/10/chartex" xmlns:cx5="http://schemas.microsoft.com/office/drawing/2016/5/11/chartex" xmlns:cx6="http://schemas.microsoft.com/office/drawing/2016/5/12/chartex" xmlns:cx7="http://schemas.microsoft.com/office/drawing/2016/5/13/chartex" xmlns:cx8="http://schemas.microsoft.com/office/drawing/2016/5/14/chartex" xmlns:mc="http://schemas.openxmlformats.org/markup-compatibility/2006" xmlns:aink="http://schemas.microsoft.com/office/drawing/2016/ink" xmlns:am3d="http://schemas.microsoft.com/office/drawing/2017/model3d" xmlns:o="urn:schemas-microsoft-com:office:office" xmlns:oel="http://schemas.microsoft.com/office/2019/extlst" xmlns:r="http://schemas.openxmlformats.org/officeDocument/2006/relationships" xmlns:m="http://schemas.openxmlformats.org/officeDocument/2006/math" xmlns:v="urn:schemas-microsoft-com:vml" xmlns:wp14="http://schemas.microsoft.com/office/word/2010/wordprocessingDrawing" xmlns:wp="http://schemas.openxmlformats.org/drawingml/2006/wordprocessingDrawing" xmlns:w10="urn:schemas-microsoft-com:office:word" xmlns:w="http://schemas.openxmlformats.org/wordprocessingml/2006/main" xmlns:w14="http://schemas.microsoft.com/office/word/2010/wordml" xmlns:w15="http://schemas.microsoft.com/office/word/2012/wordml" xmlns:w16cex="http://schemas.microsoft.com/office/word/2018/wordml/cex" xmlns:w16cid="http://schemas.microsoft.com/office/word/2016/wordml/cid" xmlns:w16="http://schemas.microsoft.com/office/word/2018/wordml" xmlns:w16du="http://schemas.microsoft.com/office/word/2023/wordml/word16du" xmlns:w16sdtdh="http://schemas.microsoft.com/office/word/2020/wordml/sdtdatahash" xmlns:w16sdtfl="http://schemas.microsoft.com/office/word/2024/wordml/sdtformatlock" xmlns:w16se="http://schemas.microsoft.com/office/word/2015/wordml/symex" xmlns:wpg="http://schemas.microsoft.com/office/word/2010/wordprocessingGroup" xmlns:wpi="http://schemas.microsoft.com/office/word/2010/wordprocessingInk" xmlns:wne="http://schemas.microsoft.com/office/word/2006/wordml" xmlns:wps="http://schemas.microsoft.com/office/word/2010/wordprocessingShape" mc:Ignorable="w14 w15 w16se w16cid w16 w16cex w16sdtdh w16sdtfl w16du wp14">
   <w:abstractNum w:abstractNumId="0" w15:restartNumberingAfterBreak="0">
-    <w:nsid w:val="1EE16662"/>
+    <w:nsid w:val="46655E69"/>
     <w:multiLevelType w:val="hybridMultilevel"/>
-    <w:tmpl w:val="1CAE7F4A"/>
-    <w:lvl w:ilvl="0" w:tplc="A470D2FC">
+    <w:tmpl w:val="5EA07A7E"/>
+    <w:lvl w:ilvl="0" w:tplc="AF1400D0">
       <w:start w:val="1"/>
       <w:numFmt w:val="decimal"/>
       <w:lvlText w:val="%1."/>
@@ -7033,52 +7033,52 @@
         <w:ind w:left="560" w:hanging="340"/>
       </w:pPr>
     </w:lvl>
-    <w:lvl w:ilvl="1" w:tplc="8D625474">
+    <w:lvl w:ilvl="1" w:tplc="A2FC3978">
       <w:numFmt w:val="decimal"/>
       <w:lvlText w:val=""/>
       <w:lvlJc w:val="left"/>
     </w:lvl>
-    <w:lvl w:ilvl="2" w:tplc="35EE7CA2">
+    <w:lvl w:ilvl="2" w:tplc="056C4FB8">
       <w:numFmt w:val="decimal"/>
       <w:lvlText w:val=""/>
       <w:lvlJc w:val="left"/>
     </w:lvl>
-    <w:lvl w:ilvl="3" w:tplc="DE9A63C8">
+    <w:lvl w:ilvl="3" w:tplc="A83A30FC">
       <w:numFmt w:val="decimal"/>
       <w:lvlText w:val=""/>
       <w:lvlJc w:val="left"/>
     </w:lvl>
-    <w:lvl w:ilvl="4" w:tplc="894EF68C">
+    <w:lvl w:ilvl="4" w:tplc="AF201290">
       <w:numFmt w:val="decimal"/>
       <w:lvlText w:val=""/>
       <w:lvlJc w:val="left"/>
     </w:lvl>
-    <w:lvl w:ilvl="5" w:tplc="F1FCE9B4">
+    <w:lvl w:ilvl="5" w:tplc="A190B27C">
       <w:numFmt w:val="decimal"/>
       <w:lvlText w:val=""/>
       <w:lvlJc w:val="left"/>
     </w:lvl>
-    <w:lvl w:ilvl="6" w:tplc="2C44AF0E">
+    <w:lvl w:ilvl="6" w:tplc="D512C1A2">
       <w:numFmt w:val="decimal"/>
       <w:lvlText w:val=""/>
       <w:lvlJc w:val="left"/>
     </w:lvl>
-    <w:lvl w:ilvl="7" w:tplc="35D8EA06">
+    <w:lvl w:ilvl="7" w:tplc="F1A28CA0">
       <w:numFmt w:val="decimal"/>
       <w:lvlText w:val=""/>
       <w:lvlJc w:val="left"/>
     </w:lvl>
-    <w:lvl w:ilvl="8" w:tplc="705AB804">
+    <w:lvl w:ilvl="8" w:tplc="388E21DC">
       <w:numFmt w:val="decimal"/>
       <w:lvlText w:val=""/>
       <w:lvlJc w:val="left"/>
     </w:lvl>
   </w:abstractNum>
   <w:abstractNum w:abstractNumId="1" w15:restartNumberingAfterBreak="0">
-    <w:nsid w:val="278D7972"/>
+    <w:nsid w:val="4E880969"/>
     <w:multiLevelType w:val="hybridMultilevel"/>
-    <w:tmpl w:val="BEAEC680"/>
-    <w:lvl w:ilvl="0" w:tplc="CC36E3E4">
+    <w:tmpl w:val="5C34A6EA"/>
+    <w:lvl w:ilvl="0" w:tplc="F2E0FC36">
       <w:start w:val="1"/>
       <w:numFmt w:val="bullet"/>
       <w:lvlText w:val="●"/>
@@ -7087,7 +7087,7 @@
         <w:ind w:left="720" w:hanging="360"/>
       </w:pPr>
     </w:lvl>
-    <w:lvl w:ilvl="1" w:tplc="2FE01586">
+    <w:lvl w:ilvl="1" w:tplc="32C63184">
       <w:start w:val="1"/>
       <w:numFmt w:val="bullet"/>
       <w:lvlText w:val="○"/>
@@ -7096,7 +7096,7 @@
         <w:ind w:left="1440" w:hanging="360"/>
       </w:pPr>
     </w:lvl>
-    <w:lvl w:ilvl="2" w:tplc="1C229D2A">
+    <w:lvl w:ilvl="2" w:tplc="E9AE55C0">
       <w:start w:val="1"/>
       <w:numFmt w:val="bullet"/>
       <w:lvlText w:val="■"/>
@@ -7105,7 +7105,7 @@
         <w:ind w:left="2160" w:hanging="360"/>
       </w:pPr>
     </w:lvl>
-    <w:lvl w:ilvl="3" w:tplc="EBEEB80E">
+    <w:lvl w:ilvl="3" w:tplc="171AA678">
       <w:start w:val="1"/>
       <w:numFmt w:val="bullet"/>
       <w:lvlText w:val="●"/>
@@ -7114,7 +7114,7 @@
         <w:ind w:left="2880" w:hanging="360"/>
       </w:pPr>
     </w:lvl>
-    <w:lvl w:ilvl="4" w:tplc="8C96CA72">
+    <w:lvl w:ilvl="4" w:tplc="F3D011CC">
       <w:start w:val="1"/>
       <w:numFmt w:val="bullet"/>
       <w:lvlText w:val="○"/>
@@ -7123,7 +7123,7 @@
         <w:ind w:left="3600" w:hanging="360"/>
       </w:pPr>
     </w:lvl>
-    <w:lvl w:ilvl="5" w:tplc="22C09A8E">
+    <w:lvl w:ilvl="5" w:tplc="1DD49F5C">
       <w:start w:val="1"/>
       <w:numFmt w:val="bullet"/>
       <w:lvlText w:val="■"/>
@@ -7132,7 +7132,7 @@
         <w:ind w:left="4320" w:hanging="360"/>
       </w:pPr>
     </w:lvl>
-    <w:lvl w:ilvl="6" w:tplc="E52E9412">
+    <w:lvl w:ilvl="6" w:tplc="131A1FAA">
       <w:start w:val="1"/>
       <w:numFmt w:val="bullet"/>
       <w:lvlText w:val="●"/>
@@ -7141,7 +7141,7 @@
         <w:ind w:left="5040" w:hanging="360"/>
       </w:pPr>
     </w:lvl>
-    <w:lvl w:ilvl="7" w:tplc="0C0EED42">
+    <w:lvl w:ilvl="7" w:tplc="094607CE">
       <w:start w:val="1"/>
       <w:numFmt w:val="bullet"/>
       <w:lvlText w:val="●"/>
@@ -7150,7 +7150,7 @@
         <w:ind w:left="5760" w:hanging="360"/>
       </w:pPr>
     </w:lvl>
-    <w:lvl w:ilvl="8" w:tplc="A9A807A6">
+    <w:lvl w:ilvl="8" w:tplc="BDC00476">
       <w:start w:val="1"/>
       <w:numFmt w:val="bullet"/>
       <w:lvlText w:val="●"/>
@@ -7161,10 +7161,10 @@
     </w:lvl>
   </w:abstractNum>
   <w:abstractNum w:abstractNumId="2" w15:restartNumberingAfterBreak="0">
-    <w:nsid w:val="750A4BDD"/>
+    <w:nsid w:val="5D2B7A49"/>
     <w:multiLevelType w:val="hybridMultilevel"/>
-    <w:tmpl w:val="26AC1EC6"/>
-    <w:lvl w:ilvl="0" w:tplc="F912E86C">
+    <w:tmpl w:val="4998B480"/>
+    <w:lvl w:ilvl="0" w:tplc="2D2C631E">
       <w:start w:val="1"/>
       <w:numFmt w:val="bullet"/>
       <w:lvlText w:val="•"/>
@@ -7173,48 +7173,48 @@
         <w:ind w:left="560" w:hanging="280"/>
       </w:pPr>
     </w:lvl>
-    <w:lvl w:ilvl="1" w:tplc="06F65F74">
+    <w:lvl w:ilvl="1" w:tplc="DDD6EC6A">
       <w:numFmt w:val="decimal"/>
       <w:lvlText w:val=""/>
       <w:lvlJc w:val="left"/>
     </w:lvl>
-    <w:lvl w:ilvl="2" w:tplc="5A2CBF8A">
+    <w:lvl w:ilvl="2" w:tplc="38A0D2CC">
       <w:numFmt w:val="decimal"/>
       <w:lvlText w:val=""/>
       <w:lvlJc w:val="left"/>
     </w:lvl>
-    <w:lvl w:ilvl="3" w:tplc="8DAA4854">
+    <w:lvl w:ilvl="3" w:tplc="719CE452">
       <w:numFmt w:val="decimal"/>
       <w:lvlText w:val=""/>
       <w:lvlJc w:val="left"/>
     </w:lvl>
-    <w:lvl w:ilvl="4" w:tplc="40C0746C">
+    <w:lvl w:ilvl="4" w:tplc="D3004324">
       <w:numFmt w:val="decimal"/>
       <w:lvlText w:val=""/>
       <w:lvlJc w:val="left"/>
     </w:lvl>
-    <w:lvl w:ilvl="5" w:tplc="BA8035E0">
+    <w:lvl w:ilvl="5" w:tplc="2B9C6380">
       <w:numFmt w:val="decimal"/>
       <w:lvlText w:val=""/>
       <w:lvlJc w:val="left"/>
     </w:lvl>
-    <w:lvl w:ilvl="6" w:tplc="2550FAB2">
+    <w:lvl w:ilvl="6" w:tplc="A1FE124C">
       <w:numFmt w:val="decimal"/>
       <w:lvlText w:val=""/>
       <w:lvlJc w:val="left"/>
     </w:lvl>
-    <w:lvl w:ilvl="7" w:tplc="32C62B08">
+    <w:lvl w:ilvl="7" w:tplc="49A82204">
       <w:numFmt w:val="decimal"/>
       <w:lvlText w:val=""/>
       <w:lvlJc w:val="left"/>
     </w:lvl>
-    <w:lvl w:ilvl="8" w:tplc="3EA00D48">
+    <w:lvl w:ilvl="8" w:tplc="651EBC32">
       <w:numFmt w:val="decimal"/>
       <w:lvlText w:val=""/>
       <w:lvlJc w:val="left"/>
     </w:lvl>
   </w:abstractNum>
-  <w:num w:numId="1" w16cid:durableId="1107695007">
+  <w:num w:numId="1" w16cid:durableId="1965694140">
     <w:abstractNumId w:val="1"/>
     <w:lvlOverride w:ilvl="0">
       <w:startOverride w:val="1"/>
@@ -7807,7 +7807,7 @@
     <w:autoRedefine/>
     <w:uiPriority w:val="39"/>
     <w:unhideWhenUsed/>
-    <w:rsid w:val="005C3B02"/>
+    <w:rsid w:val="00657298"/>
     <w:pPr>
       <w:spacing w:after="100"/>
     </w:pPr>

</xml_diff>